<commit_message>
fix: intercambios en tabla, usuario en la barra y quitar index.js
</commit_message>
<xml_diff>
--- a/docs/memoria_producto1_FP066.docx
+++ b/docs/memoria_producto1_FP066.docx
@@ -34,23 +34,13 @@
       <w:pPr>
         <w:spacing w:after="600"/>
       </w:pPr>
-      <w:proofErr w:type="spellStart"/>
       <w:r>
         <w:rPr>
           <w:color w:val="2F6FD0"/>
           <w:sz w:val="30"/>
           <w:szCs w:val="30"/>
         </w:rPr>
-        <w:t>Frontend</w:t>
-      </w:r>
-      <w:proofErr w:type="spellEnd"/>
-      <w:r>
-        <w:rPr>
-          <w:color w:val="2F6FD0"/>
-          <w:sz w:val="30"/>
-          <w:szCs w:val="30"/>
-        </w:rPr>
-        <w:t xml:space="preserve"> en HTML5, CSS3, Bootstrap y JavaScript</w:t>
+        <w:t>Frontend en HTML5, CSS3, Bootstrap y JavaScript</w:t>
       </w:r>
     </w:p>
     <w:tbl>
@@ -75,12 +65,6 @@
         <w:gridCol w:w="6626"/>
       </w:tblGrid>
       <w:tr>
-        <w:tblPrEx>
-          <w:tblCellMar>
-            <w:top w:w="0" w:type="dxa"/>
-            <w:bottom w:w="0" w:type="dxa"/>
-          </w:tblCellMar>
-        </w:tblPrEx>
         <w:trPr>
           <w:tblHeader/>
         </w:trPr>
@@ -152,12 +136,6 @@
         </w:tc>
       </w:tr>
       <w:tr>
-        <w:tblPrEx>
-          <w:tblCellMar>
-            <w:top w:w="0" w:type="dxa"/>
-            <w:bottom w:w="0" w:type="dxa"/>
-          </w:tblCellMar>
-        </w:tblPrEx>
         <w:trPr>
           <w:cantSplit/>
         </w:trPr>
@@ -217,34 +195,12 @@
                 <w:sz w:val="21"/>
                 <w:szCs w:val="21"/>
               </w:rPr>
-              <w:t xml:space="preserve">FP066 · Desarrollo full </w:t>
-            </w:r>
-            <w:proofErr w:type="spellStart"/>
-            <w:r>
-              <w:rPr>
-                <w:sz w:val="21"/>
-                <w:szCs w:val="21"/>
-              </w:rPr>
-              <w:t>stack</w:t>
-            </w:r>
-            <w:proofErr w:type="spellEnd"/>
-            <w:r>
-              <w:rPr>
-                <w:sz w:val="21"/>
-                <w:szCs w:val="21"/>
-              </w:rPr>
-              <w:t xml:space="preserve"> con JavaScript y servicios web</w:t>
+              <w:t>FP066 · Desarrollo full stack con JavaScript y servicios web</w:t>
             </w:r>
           </w:p>
         </w:tc>
       </w:tr>
       <w:tr>
-        <w:tblPrEx>
-          <w:tblCellMar>
-            <w:top w:w="0" w:type="dxa"/>
-            <w:bottom w:w="0" w:type="dxa"/>
-          </w:tblCellMar>
-        </w:tblPrEx>
         <w:trPr>
           <w:cantSplit/>
         </w:trPr>
@@ -310,12 +266,6 @@
         </w:tc>
       </w:tr>
       <w:tr>
-        <w:tblPrEx>
-          <w:tblCellMar>
-            <w:top w:w="0" w:type="dxa"/>
-            <w:bottom w:w="0" w:type="dxa"/>
-          </w:tblCellMar>
-        </w:tblPrEx>
         <w:trPr>
           <w:cantSplit/>
         </w:trPr>
@@ -381,12 +331,6 @@
         </w:tc>
       </w:tr>
       <w:tr>
-        <w:tblPrEx>
-          <w:tblCellMar>
-            <w:top w:w="0" w:type="dxa"/>
-            <w:bottom w:w="0" w:type="dxa"/>
-          </w:tblCellMar>
-        </w:tblPrEx>
         <w:trPr>
           <w:cantSplit/>
         </w:trPr>
@@ -459,6 +403,12 @@
     </w:p>
     <w:sdt>
       <w:sdtPr>
+        <w:rPr>
+          <w:rFonts w:ascii="Calibri" w:eastAsia="Calibri" w:hAnsi="Calibri" w:cs="Calibri"/>
+          <w:color w:val="auto"/>
+          <w:sz w:val="22"/>
+          <w:szCs w:val="22"/>
+        </w:rPr>
         <w:id w:val="77806240"/>
         <w:docPartObj>
           <w:docPartGallery w:val="Table of Contents"/>
@@ -467,12 +417,8 @@
       </w:sdtPr>
       <w:sdtEndPr>
         <w:rPr>
-          <w:rFonts w:ascii="Calibri" w:eastAsia="Calibri" w:hAnsi="Calibri" w:cs="Calibri"/>
           <w:b/>
           <w:bCs/>
-          <w:color w:val="auto"/>
-          <w:sz w:val="22"/>
-          <w:szCs w:val="22"/>
         </w:rPr>
       </w:sdtEndPr>
       <w:sdtContent>
@@ -2020,12 +1966,6 @@
         <w:gridCol w:w="9440"/>
       </w:tblGrid>
       <w:tr>
-        <w:tblPrEx>
-          <w:tblCellMar>
-            <w:top w:w="0" w:type="dxa"/>
-            <w:bottom w:w="0" w:type="dxa"/>
-          </w:tblCellMar>
-        </w:tblPrEx>
         <w:trPr>
           <w:tblHeader/>
         </w:trPr>
@@ -2097,12 +2037,6 @@
         </w:tc>
       </w:tr>
       <w:tr>
-        <w:tblPrEx>
-          <w:tblCellMar>
-            <w:top w:w="0" w:type="dxa"/>
-            <w:bottom w:w="0" w:type="dxa"/>
-          </w:tblCellMar>
-        </w:tblPrEx>
         <w:trPr>
           <w:cantSplit/>
         </w:trPr>
@@ -2168,12 +2102,6 @@
         </w:tc>
       </w:tr>
       <w:tr>
-        <w:tblPrEx>
-          <w:tblCellMar>
-            <w:top w:w="0" w:type="dxa"/>
-            <w:bottom w:w="0" w:type="dxa"/>
-          </w:tblCellMar>
-        </w:tblPrEx>
         <w:trPr>
           <w:cantSplit/>
         </w:trPr>
@@ -2239,12 +2167,6 @@
         </w:tc>
       </w:tr>
       <w:tr>
-        <w:tblPrEx>
-          <w:tblCellMar>
-            <w:top w:w="0" w:type="dxa"/>
-            <w:bottom w:w="0" w:type="dxa"/>
-          </w:tblCellMar>
-        </w:tblPrEx>
         <w:trPr>
           <w:cantSplit/>
         </w:trPr>
@@ -2308,14 +2230,6 @@
             <w:pPr>
               <w:spacing w:after="40" w:line="260" w:lineRule="auto"/>
             </w:pPr>
-            <w:r>
-              <w:rPr>
-                <w:sz w:val="19"/>
-                <w:szCs w:val="19"/>
-                <w:highlight w:val="yellow"/>
-              </w:rPr>
-              <w:t>[pegar enlace; importar desde GitHub y comprobar que funciona]</w:t>
-            </w:r>
           </w:p>
         </w:tc>
       </w:tr>
@@ -2343,15 +2257,7 @@
         <w:spacing w:after="120" w:line="300" w:lineRule="auto"/>
       </w:pPr>
       <w:r>
-        <w:t xml:space="preserve">Tándem es una plataforma web donde personas que quieren practicar idiomas publican ofertas (lo que pueden enseñar) y peticiones (lo que quieren aprender) y se ponen en contacto con quien les interesa. Este producto es solo el </w:t>
-      </w:r>
-      <w:proofErr w:type="spellStart"/>
-      <w:r>
-        <w:t>frontend</w:t>
-      </w:r>
-      <w:proofErr w:type="spellEnd"/>
-      <w:r>
-        <w:t>: no hay servidor ni base de datos, y los datos de ejemplo viven en memoria.</w:t>
+        <w:t>Tándem es una plataforma web donde personas que quieren practicar idiomas publican ofertas (lo que pueden enseñar) y peticiones (lo que quieren aprender) y se ponen en contacto con quien les interesa. Este producto es solo el frontend: no hay servidor ni base de datos, y los datos de ejemplo viven en memoria.</w:t>
       </w:r>
     </w:p>
     <w:p>
@@ -2430,13 +2336,8 @@
         </w:rPr>
         <w:t xml:space="preserve">Pantallas: </w:t>
       </w:r>
-      <w:proofErr w:type="spellStart"/>
       <w:r>
-        <w:t>Dashboard</w:t>
-      </w:r>
-      <w:proofErr w:type="spellEnd"/>
-      <w:r>
-        <w:t>, Login, Intercambios y Usuarios.</w:t>
+        <w:t>Dashboard, Login, Intercambios y Usuarios.</w:t>
       </w:r>
     </w:p>
     <w:p>
@@ -2518,12 +2419,6 @@
         <w:gridCol w:w="6626"/>
       </w:tblGrid>
       <w:tr>
-        <w:tblPrEx>
-          <w:tblCellMar>
-            <w:top w:w="0" w:type="dxa"/>
-            <w:bottom w:w="0" w:type="dxa"/>
-          </w:tblCellMar>
-        </w:tblPrEx>
         <w:trPr>
           <w:tblHeader/>
         </w:trPr>
@@ -2595,12 +2490,6 @@
         </w:tc>
       </w:tr>
       <w:tr>
-        <w:tblPrEx>
-          <w:tblCellMar>
-            <w:top w:w="0" w:type="dxa"/>
-            <w:bottom w:w="0" w:type="dxa"/>
-          </w:tblCellMar>
-        </w:tblPrEx>
         <w:trPr>
           <w:cantSplit/>
         </w:trPr>
@@ -2666,12 +2555,6 @@
         </w:tc>
       </w:tr>
       <w:tr>
-        <w:tblPrEx>
-          <w:tblCellMar>
-            <w:top w:w="0" w:type="dxa"/>
-            <w:bottom w:w="0" w:type="dxa"/>
-          </w:tblCellMar>
-        </w:tblPrEx>
         <w:trPr>
           <w:cantSplit/>
         </w:trPr>
@@ -2737,12 +2620,6 @@
         </w:tc>
       </w:tr>
       <w:tr>
-        <w:tblPrEx>
-          <w:tblCellMar>
-            <w:top w:w="0" w:type="dxa"/>
-            <w:bottom w:w="0" w:type="dxa"/>
-          </w:tblCellMar>
-        </w:tblPrEx>
         <w:trPr>
           <w:cantSplit/>
         </w:trPr>
@@ -2808,12 +2685,6 @@
         </w:tc>
       </w:tr>
       <w:tr>
-        <w:tblPrEx>
-          <w:tblCellMar>
-            <w:top w:w="0" w:type="dxa"/>
-            <w:bottom w:w="0" w:type="dxa"/>
-          </w:tblCellMar>
-        </w:tblPrEx>
         <w:trPr>
           <w:cantSplit/>
         </w:trPr>
@@ -2879,12 +2750,6 @@
         </w:tc>
       </w:tr>
       <w:tr>
-        <w:tblPrEx>
-          <w:tblCellMar>
-            <w:top w:w="0" w:type="dxa"/>
-            <w:bottom w:w="0" w:type="dxa"/>
-          </w:tblCellMar>
-        </w:tblPrEx>
         <w:trPr>
           <w:cantSplit/>
         </w:trPr>
@@ -2950,12 +2815,6 @@
         </w:tc>
       </w:tr>
       <w:tr>
-        <w:tblPrEx>
-          <w:tblCellMar>
-            <w:top w:w="0" w:type="dxa"/>
-            <w:bottom w:w="0" w:type="dxa"/>
-          </w:tblCellMar>
-        </w:tblPrEx>
         <w:trPr>
           <w:cantSplit/>
         </w:trPr>
@@ -3021,12 +2880,6 @@
         </w:tc>
       </w:tr>
       <w:tr>
-        <w:tblPrEx>
-          <w:tblCellMar>
-            <w:top w:w="0" w:type="dxa"/>
-            <w:bottom w:w="0" w:type="dxa"/>
-          </w:tblCellMar>
-        </w:tblPrEx>
         <w:trPr>
           <w:cantSplit/>
         </w:trPr>
@@ -3092,12 +2945,6 @@
         </w:tc>
       </w:tr>
       <w:tr>
-        <w:tblPrEx>
-          <w:tblCellMar>
-            <w:top w:w="0" w:type="dxa"/>
-            <w:bottom w:w="0" w:type="dxa"/>
-          </w:tblCellMar>
-        </w:tblPrEx>
         <w:trPr>
           <w:cantSplit/>
         </w:trPr>
@@ -3210,12 +3057,6 @@
         <w:gridCol w:w="6626"/>
       </w:tblGrid>
       <w:tr>
-        <w:tblPrEx>
-          <w:tblCellMar>
-            <w:top w:w="0" w:type="dxa"/>
-            <w:bottom w:w="0" w:type="dxa"/>
-          </w:tblCellMar>
-        </w:tblPrEx>
         <w:trPr>
           <w:tblHeader/>
         </w:trPr>
@@ -3287,12 +3128,6 @@
         </w:tc>
       </w:tr>
       <w:tr>
-        <w:tblPrEx>
-          <w:tblCellMar>
-            <w:top w:w="0" w:type="dxa"/>
-            <w:bottom w:w="0" w:type="dxa"/>
-          </w:tblCellMar>
-        </w:tblPrEx>
         <w:trPr>
           <w:cantSplit/>
         </w:trPr>
@@ -3358,12 +3193,6 @@
         </w:tc>
       </w:tr>
       <w:tr>
-        <w:tblPrEx>
-          <w:tblCellMar>
-            <w:top w:w="0" w:type="dxa"/>
-            <w:bottom w:w="0" w:type="dxa"/>
-          </w:tblCellMar>
-        </w:tblPrEx>
         <w:trPr>
           <w:cantSplit/>
         </w:trPr>
@@ -3429,12 +3258,6 @@
         </w:tc>
       </w:tr>
       <w:tr>
-        <w:tblPrEx>
-          <w:tblCellMar>
-            <w:top w:w="0" w:type="dxa"/>
-            <w:bottom w:w="0" w:type="dxa"/>
-          </w:tblCellMar>
-        </w:tblPrEx>
         <w:trPr>
           <w:cantSplit/>
         </w:trPr>
@@ -3500,12 +3323,6 @@
         </w:tc>
       </w:tr>
       <w:tr>
-        <w:tblPrEx>
-          <w:tblCellMar>
-            <w:top w:w="0" w:type="dxa"/>
-            <w:bottom w:w="0" w:type="dxa"/>
-          </w:tblCellMar>
-        </w:tblPrEx>
         <w:trPr>
           <w:cantSplit/>
         </w:trPr>
@@ -3571,12 +3388,6 @@
         </w:tc>
       </w:tr>
       <w:tr>
-        <w:tblPrEx>
-          <w:tblCellMar>
-            <w:top w:w="0" w:type="dxa"/>
-            <w:bottom w:w="0" w:type="dxa"/>
-          </w:tblCellMar>
-        </w:tblPrEx>
         <w:trPr>
           <w:cantSplit/>
         </w:trPr>
@@ -3642,12 +3453,6 @@
         </w:tc>
       </w:tr>
       <w:tr>
-        <w:tblPrEx>
-          <w:tblCellMar>
-            <w:top w:w="0" w:type="dxa"/>
-            <w:bottom w:w="0" w:type="dxa"/>
-          </w:tblCellMar>
-        </w:tblPrEx>
         <w:trPr>
           <w:cantSplit/>
         </w:trPr>
@@ -3713,12 +3518,6 @@
         </w:tc>
       </w:tr>
       <w:tr>
-        <w:tblPrEx>
-          <w:tblCellMar>
-            <w:top w:w="0" w:type="dxa"/>
-            <w:bottom w:w="0" w:type="dxa"/>
-          </w:tblCellMar>
-        </w:tblPrEx>
         <w:trPr>
           <w:cantSplit/>
         </w:trPr>
@@ -3784,12 +3583,6 @@
         </w:tc>
       </w:tr>
       <w:tr>
-        <w:tblPrEx>
-          <w:tblCellMar>
-            <w:top w:w="0" w:type="dxa"/>
-            <w:bottom w:w="0" w:type="dxa"/>
-          </w:tblCellMar>
-        </w:tblPrEx>
         <w:trPr>
           <w:cantSplit/>
         </w:trPr>
@@ -3884,15 +3677,7 @@
         <w:spacing w:after="120" w:line="300" w:lineRule="auto"/>
       </w:pPr>
       <w:r>
-        <w:t>Sistema de diseño aplicado: oferta = verde y petición = naranja, siempre acompañadas de la etiqueta de texto «Oferta» / «Petición» para no depender solo del color; tipografía Poppins; esquinas redondeadas; animación suave al aparecer y al pasar el ratón; menos movimiento si el sistema lo pide (</w:t>
-      </w:r>
-      <w:proofErr w:type="spellStart"/>
-      <w:r>
-        <w:t>prefers-reduced-motion</w:t>
-      </w:r>
-      <w:proofErr w:type="spellEnd"/>
-      <w:r>
-        <w:t>).</w:t>
+        <w:t>Sistema de diseño aplicado: oferta = verde y petición = naranja, siempre acompañadas de la etiqueta de texto «Oferta» / «Petición» para no depender solo del color; tipografía Poppins; esquinas redondeadas; animación suave al aparecer y al pasar el ratón; menos movimiento si el sistema lo pide (prefers-reduced-motion).</w:t>
       </w:r>
     </w:p>
     <w:p>
@@ -3938,25 +3723,7 @@
           <w:sz w:val="18"/>
           <w:szCs w:val="18"/>
         </w:rPr>
-        <w:t xml:space="preserve">├── </w:t>
-      </w:r>
-      <w:proofErr w:type="spellStart"/>
-      <w:r>
-        <w:rPr>
-          <w:rFonts w:ascii="Consolas" w:eastAsia="Consolas" w:hAnsi="Consolas" w:cs="Consolas"/>
-          <w:sz w:val="18"/>
-          <w:szCs w:val="18"/>
-        </w:rPr>
-        <w:t>src</w:t>
-      </w:r>
-      <w:proofErr w:type="spellEnd"/>
-      <w:r>
-        <w:rPr>
-          <w:rFonts w:ascii="Consolas" w:eastAsia="Consolas" w:hAnsi="Consolas" w:cs="Consolas"/>
-          <w:sz w:val="18"/>
-          <w:szCs w:val="18"/>
-        </w:rPr>
-        <w:t>/</w:t>
+        <w:t>├── src/</w:t>
       </w:r>
     </w:p>
     <w:p>
@@ -3970,25 +3737,7 @@
           <w:sz w:val="18"/>
           <w:szCs w:val="18"/>
         </w:rPr>
-        <w:t xml:space="preserve">│   ├── </w:t>
-      </w:r>
-      <w:proofErr w:type="spellStart"/>
-      <w:r>
-        <w:rPr>
-          <w:rFonts w:ascii="Consolas" w:eastAsia="Consolas" w:hAnsi="Consolas" w:cs="Consolas"/>
-          <w:sz w:val="18"/>
-          <w:szCs w:val="18"/>
-        </w:rPr>
-        <w:t>pages</w:t>
-      </w:r>
-      <w:proofErr w:type="spellEnd"/>
-      <w:r>
-        <w:rPr>
-          <w:rFonts w:ascii="Consolas" w:eastAsia="Consolas" w:hAnsi="Consolas" w:cs="Consolas"/>
-          <w:sz w:val="18"/>
-          <w:szCs w:val="18"/>
-        </w:rPr>
-        <w:t>/</w:t>
+        <w:t>│   ├── pages/</w:t>
       </w:r>
     </w:p>
     <w:p>
@@ -4002,18 +3751,8 @@
           <w:sz w:val="18"/>
           <w:szCs w:val="18"/>
         </w:rPr>
-        <w:t xml:space="preserve">│   │   ├── index.html        </w:t>
+        <w:t>│   │   ├── index.html        Dashboard</w:t>
       </w:r>
-      <w:proofErr w:type="spellStart"/>
-      <w:r>
-        <w:rPr>
-          <w:rFonts w:ascii="Consolas" w:eastAsia="Consolas" w:hAnsi="Consolas" w:cs="Consolas"/>
-          <w:sz w:val="18"/>
-          <w:szCs w:val="18"/>
-        </w:rPr>
-        <w:t>Dashboard</w:t>
-      </w:r>
-      <w:proofErr w:type="spellEnd"/>
     </w:p>
     <w:p>
       <w:pPr>
@@ -4082,25 +3821,7 @@
           <w:sz w:val="18"/>
           <w:szCs w:val="18"/>
         </w:rPr>
-        <w:t xml:space="preserve">│   ├── </w:t>
-      </w:r>
-      <w:proofErr w:type="spellStart"/>
-      <w:r>
-        <w:rPr>
-          <w:rFonts w:ascii="Consolas" w:eastAsia="Consolas" w:hAnsi="Consolas" w:cs="Consolas"/>
-          <w:sz w:val="18"/>
-          <w:szCs w:val="18"/>
-        </w:rPr>
-        <w:t>css</w:t>
-      </w:r>
-      <w:proofErr w:type="spellEnd"/>
-      <w:r>
-        <w:rPr>
-          <w:rFonts w:ascii="Consolas" w:eastAsia="Consolas" w:hAnsi="Consolas" w:cs="Consolas"/>
-          <w:sz w:val="18"/>
-          <w:szCs w:val="18"/>
-        </w:rPr>
-        <w:t>/</w:t>
+        <w:t>│   ├── css/</w:t>
       </w:r>
     </w:p>
     <w:p>
@@ -4128,25 +3849,7 @@
           <w:sz w:val="18"/>
           <w:szCs w:val="18"/>
         </w:rPr>
-        <w:t xml:space="preserve">│   └── </w:t>
-      </w:r>
-      <w:proofErr w:type="spellStart"/>
-      <w:r>
-        <w:rPr>
-          <w:rFonts w:ascii="Consolas" w:eastAsia="Consolas" w:hAnsi="Consolas" w:cs="Consolas"/>
-          <w:sz w:val="18"/>
-          <w:szCs w:val="18"/>
-        </w:rPr>
-        <w:t>js</w:t>
-      </w:r>
-      <w:proofErr w:type="spellEnd"/>
-      <w:r>
-        <w:rPr>
-          <w:rFonts w:ascii="Consolas" w:eastAsia="Consolas" w:hAnsi="Consolas" w:cs="Consolas"/>
-          <w:sz w:val="18"/>
-          <w:szCs w:val="18"/>
-        </w:rPr>
-        <w:t>/</w:t>
+        <w:t>│   └── js/</w:t>
       </w:r>
     </w:p>
     <w:p>
@@ -4188,6 +3891,20 @@
           <w:sz w:val="18"/>
           <w:szCs w:val="18"/>
         </w:rPr>
+        <w:t>│       ├── nav.js            Correo del usuario logueado en la barra</w:t>
+      </w:r>
+    </w:p>
+    <w:p>
+      <w:pPr>
+        <w:shd w:val="clear" w:color="auto" w:fill="F3F5F8"/>
+        <w:spacing w:line="250" w:lineRule="auto"/>
+      </w:pPr>
+      <w:r>
+        <w:rPr>
+          <w:rFonts w:ascii="Consolas" w:eastAsia="Consolas" w:hAnsi="Consolas" w:cs="Consolas"/>
+          <w:sz w:val="18"/>
+          <w:szCs w:val="18"/>
+        </w:rPr>
         <w:t>│       ├── dashboard.js · login.js · users.js · exchanges.js</w:t>
       </w:r>
     </w:p>
@@ -4202,25 +3919,7 @@
           <w:sz w:val="18"/>
           <w:szCs w:val="18"/>
         </w:rPr>
-        <w:t xml:space="preserve">└── </w:t>
-      </w:r>
-      <w:proofErr w:type="spellStart"/>
-      <w:r>
-        <w:rPr>
-          <w:rFonts w:ascii="Consolas" w:eastAsia="Consolas" w:hAnsi="Consolas" w:cs="Consolas"/>
-          <w:sz w:val="18"/>
-          <w:szCs w:val="18"/>
-        </w:rPr>
-        <w:t>docs</w:t>
-      </w:r>
-      <w:proofErr w:type="spellEnd"/>
-      <w:r>
-        <w:rPr>
-          <w:rFonts w:ascii="Consolas" w:eastAsia="Consolas" w:hAnsi="Consolas" w:cs="Consolas"/>
-          <w:sz w:val="18"/>
-          <w:szCs w:val="18"/>
-        </w:rPr>
-        <w:t>/                     Memoria y foto del mapa conceptual</w:t>
+        <w:t>└── docs/                     Memoria y foto del mapa conceptual</w:t>
       </w:r>
     </w:p>
     <w:p>
@@ -4257,23 +3956,7 @@
         <w:spacing w:after="60" w:line="290" w:lineRule="auto"/>
       </w:pPr>
       <w:r>
-        <w:t xml:space="preserve">HTML, CSS y JavaScript en archivos separados: ningún </w:t>
-      </w:r>
-      <w:proofErr w:type="spellStart"/>
-      <w:r>
-        <w:t>onclick</w:t>
-      </w:r>
-      <w:proofErr w:type="spellEnd"/>
-      <w:r>
-        <w:t xml:space="preserve"> ni código dentro del HTML, solo &lt;script </w:t>
-      </w:r>
-      <w:proofErr w:type="spellStart"/>
-      <w:r>
-        <w:t>type</w:t>
-      </w:r>
-      <w:proofErr w:type="spellEnd"/>
-      <w:r>
-        <w:t>="module"&gt;.</w:t>
+        <w:t>HTML, CSS y JavaScript en archivos separados: ningún onclick ni código dentro del HTML, solo &lt;script type="module"&gt;.</w:t>
       </w:r>
     </w:p>
     <w:p>
@@ -4299,31 +3982,8 @@
         <w:spacing w:after="60" w:line="290" w:lineRule="auto"/>
       </w:pPr>
       <w:r>
-        <w:t xml:space="preserve">Funciones reutilizables en utils.js: </w:t>
-      </w:r>
-      <w:proofErr w:type="spellStart"/>
-      <w:r>
-        <w:t>escaparHtml</w:t>
-      </w:r>
-      <w:proofErr w:type="spellEnd"/>
-      <w:r>
-        <w:t xml:space="preserve"> (evita inyectar código), </w:t>
-      </w:r>
-      <w:proofErr w:type="spellStart"/>
-      <w:r>
-        <w:t>mostrarAviso</w:t>
-      </w:r>
-      <w:proofErr w:type="spellEnd"/>
-      <w:r>
-        <w:t xml:space="preserve"> y </w:t>
-      </w:r>
-      <w:proofErr w:type="spellStart"/>
-      <w:r>
-        <w:t>siguienteId</w:t>
-      </w:r>
-      <w:proofErr w:type="spellEnd"/>
-      <w:r>
-        <w:t>.</w:t>
+        <w:lastRenderedPageBreak/>
+        <w:t>Funciones reutilizables en utils.js: escaparHtml (evita inyectar código), mostrarAviso y siguienteId.</w:t>
       </w:r>
     </w:p>
     <w:p>
@@ -4336,7 +3996,6 @@
         <w:spacing w:after="60" w:line="290" w:lineRule="auto"/>
       </w:pPr>
       <w:r>
-        <w:lastRenderedPageBreak/>
         <w:t>Misma plantilla y barra de navegación en las 4 páginas, para que el diseño sea coherente.</w:t>
       </w:r>
     </w:p>
@@ -4350,31 +4009,7 @@
         <w:spacing w:after="60" w:line="290" w:lineRule="auto"/>
       </w:pPr>
       <w:r>
-        <w:t>Rutas relativas con</w:t>
-      </w:r>
-      <w:proofErr w:type="gramStart"/>
-      <w:r>
-        <w:t xml:space="preserve"> ..</w:t>
-      </w:r>
-      <w:proofErr w:type="gramEnd"/>
-      <w:r>
-        <w:t xml:space="preserve">/ porque las páginas están en </w:t>
-      </w:r>
-      <w:proofErr w:type="spellStart"/>
-      <w:r>
-        <w:t>src</w:t>
-      </w:r>
-      <w:proofErr w:type="spellEnd"/>
-      <w:r>
-        <w:t>/</w:t>
-      </w:r>
-      <w:proofErr w:type="spellStart"/>
-      <w:r>
-        <w:t>pages</w:t>
-      </w:r>
-      <w:proofErr w:type="spellEnd"/>
-      <w:r>
-        <w:t>/.</w:t>
+        <w:t>Rutas relativas con ../ porque las páginas están en src/pages/.</w:t>
       </w:r>
     </w:p>
     <w:p>
@@ -4387,100 +4022,8 @@
         <w:spacing w:after="60" w:line="290" w:lineRule="auto"/>
       </w:pPr>
       <w:r>
-        <w:t xml:space="preserve">Trabajo con Gitflow: ramas </w:t>
+        <w:t>Trabajo con Gitflow: ramas feature/* desde develop, pull requests con base develop y mensajes de commit con prefijos feat:, fix:, docs: y style:.</w:t>
       </w:r>
-      <w:proofErr w:type="spellStart"/>
-      <w:r>
-        <w:t>feature</w:t>
-      </w:r>
-      <w:proofErr w:type="spellEnd"/>
-      <w:r>
-        <w:t xml:space="preserve">/* desde </w:t>
-      </w:r>
-      <w:proofErr w:type="spellStart"/>
-      <w:r>
-        <w:t>develop</w:t>
-      </w:r>
-      <w:proofErr w:type="spellEnd"/>
-      <w:r>
-        <w:t xml:space="preserve">, </w:t>
-      </w:r>
-      <w:proofErr w:type="spellStart"/>
-      <w:r>
-        <w:t>pull</w:t>
-      </w:r>
-      <w:proofErr w:type="spellEnd"/>
-      <w:r>
-        <w:t xml:space="preserve"> </w:t>
-      </w:r>
-      <w:proofErr w:type="spellStart"/>
-      <w:r>
-        <w:t>requests</w:t>
-      </w:r>
-      <w:proofErr w:type="spellEnd"/>
-      <w:r>
-        <w:t xml:space="preserve"> con base </w:t>
-      </w:r>
-      <w:proofErr w:type="spellStart"/>
-      <w:r>
-        <w:t>develop</w:t>
-      </w:r>
-      <w:proofErr w:type="spellEnd"/>
-      <w:r>
-        <w:t xml:space="preserve"> y mensajes de </w:t>
-      </w:r>
-      <w:proofErr w:type="spellStart"/>
-      <w:r>
-        <w:t>commit</w:t>
-      </w:r>
-      <w:proofErr w:type="spellEnd"/>
-      <w:r>
-        <w:t xml:space="preserve"> con prefijos </w:t>
-      </w:r>
-      <w:proofErr w:type="spellStart"/>
-      <w:proofErr w:type="gramStart"/>
-      <w:r>
-        <w:t>feat</w:t>
-      </w:r>
-      <w:proofErr w:type="spellEnd"/>
-      <w:r>
-        <w:t>:,</w:t>
-      </w:r>
-      <w:proofErr w:type="gramEnd"/>
-      <w:r>
-        <w:t xml:space="preserve"> </w:t>
-      </w:r>
-      <w:proofErr w:type="spellStart"/>
-      <w:proofErr w:type="gramStart"/>
-      <w:r>
-        <w:t>fix</w:t>
-      </w:r>
-      <w:proofErr w:type="spellEnd"/>
-      <w:r>
-        <w:t>:,</w:t>
-      </w:r>
-      <w:proofErr w:type="gramEnd"/>
-      <w:r>
-        <w:t xml:space="preserve"> </w:t>
-      </w:r>
-      <w:proofErr w:type="spellStart"/>
-      <w:r>
-        <w:t>docs</w:t>
-      </w:r>
-      <w:proofErr w:type="spellEnd"/>
-      <w:r>
-        <w:t xml:space="preserve">: y </w:t>
-      </w:r>
-      <w:proofErr w:type="spellStart"/>
-      <w:proofErr w:type="gramStart"/>
-      <w:r>
-        <w:t>style</w:t>
-      </w:r>
-      <w:proofErr w:type="spellEnd"/>
-      <w:r>
-        <w:t>:.</w:t>
-      </w:r>
-      <w:proofErr w:type="gramEnd"/>
     </w:p>
     <w:p>
       <w:pPr>
@@ -4492,15 +4035,7 @@
         <w:spacing w:after="60" w:line="290" w:lineRule="auto"/>
       </w:pPr>
       <w:r>
-        <w:t xml:space="preserve">Comentarios en el código y </w:t>
-      </w:r>
-      <w:proofErr w:type="spellStart"/>
-      <w:r>
-        <w:t>prompts</w:t>
-      </w:r>
-      <w:proofErr w:type="spellEnd"/>
-      <w:r>
-        <w:t xml:space="preserve"> de IA documentados en la cabecera de cada archivo.</w:t>
+        <w:t>Comentarios en el código y prompts de IA documentados en la cabecera de cada archivo.</w:t>
       </w:r>
     </w:p>
     <w:p>
@@ -4536,29 +4071,7 @@
           <w:sz w:val="25"/>
           <w:szCs w:val="25"/>
         </w:rPr>
-        <w:t xml:space="preserve">5.1 </w:t>
-      </w:r>
-      <w:proofErr w:type="spellStart"/>
-      <w:r>
-        <w:rPr>
-          <w:b/>
-          <w:bCs/>
-          <w:color w:val="2F6FD0"/>
-          <w:sz w:val="25"/>
-          <w:szCs w:val="25"/>
-        </w:rPr>
-        <w:t>Dashboard</w:t>
-      </w:r>
-      <w:proofErr w:type="spellEnd"/>
-      <w:r>
-        <w:rPr>
-          <w:b/>
-          <w:bCs/>
-          <w:color w:val="2F6FD0"/>
-          <w:sz w:val="25"/>
-          <w:szCs w:val="25"/>
-        </w:rPr>
-        <w:t xml:space="preserve"> (index.html)</w:t>
+        <w:t>5.1 Dashboard (index.html)</w:t>
       </w:r>
       <w:bookmarkEnd w:id="9"/>
     </w:p>
@@ -4610,15 +4123,7 @@
         <w:spacing w:after="60" w:line="290" w:lineRule="auto"/>
       </w:pPr>
       <w:r>
-        <w:t>Menú plegable en móvil (</w:t>
-      </w:r>
-      <w:proofErr w:type="gramStart"/>
-      <w:r>
-        <w:t>botón hamburguesa</w:t>
-      </w:r>
-      <w:proofErr w:type="gramEnd"/>
-      <w:r>
-        <w:t xml:space="preserve"> de Bootstrap).</w:t>
+        <w:t>Menú plegable en móvil (botón hamburguesa de Bootstrap).</w:t>
       </w:r>
     </w:p>
     <w:tbl>
@@ -4643,12 +4148,6 @@
         <w:gridCol w:w="3126"/>
       </w:tblGrid>
       <w:tr>
-        <w:tblPrEx>
-          <w:tblCellMar>
-            <w:top w:w="0" w:type="dxa"/>
-            <w:bottom w:w="0" w:type="dxa"/>
-          </w:tblCellMar>
-        </w:tblPrEx>
         <w:trPr>
           <w:cantSplit/>
         </w:trPr>
@@ -4784,12 +4283,6 @@
         </w:tc>
       </w:tr>
       <w:tr>
-        <w:tblPrEx>
-          <w:tblCellMar>
-            <w:top w:w="0" w:type="dxa"/>
-            <w:bottom w:w="0" w:type="dxa"/>
-          </w:tblCellMar>
-        </w:tblPrEx>
         <w:tc>
           <w:tcPr>
             <w:tcW w:w="5900" w:type="dxa"/>
@@ -4846,25 +4339,7 @@
                 <w:sz w:val="17"/>
                 <w:szCs w:val="17"/>
               </w:rPr>
-              <w:t xml:space="preserve">Móvil (390 </w:t>
-            </w:r>
-            <w:proofErr w:type="spellStart"/>
-            <w:r>
-              <w:rPr>
-                <w:color w:val="5B6572"/>
-                <w:sz w:val="17"/>
-                <w:szCs w:val="17"/>
-              </w:rPr>
-              <w:t>px</w:t>
-            </w:r>
-            <w:proofErr w:type="spellEnd"/>
-            <w:r>
-              <w:rPr>
-                <w:color w:val="5B6572"/>
-                <w:sz w:val="17"/>
-                <w:szCs w:val="17"/>
-              </w:rPr>
-              <w:t>)</w:t>
+              <w:t>Móvil (390 px)</w:t>
             </w:r>
           </w:p>
         </w:tc>
@@ -4915,15 +4390,7 @@
         <w:spacing w:after="60" w:line="290" w:lineRule="auto"/>
       </w:pPr>
       <w:r>
-        <w:t xml:space="preserve">Validación con </w:t>
-      </w:r>
-      <w:proofErr w:type="spellStart"/>
-      <w:r>
-        <w:t>checkValidity</w:t>
-      </w:r>
-      <w:proofErr w:type="spellEnd"/>
-      <w:r>
-        <w:t xml:space="preserve"> y los avisos rojos de Bootstrap.</w:t>
+        <w:t>Validación con checkValidity y los avisos rojos de Bootstrap.</w:t>
       </w:r>
     </w:p>
     <w:p>
@@ -4937,7 +4404,7 @@
         <w:spacing w:after="60" w:line="290" w:lineRule="auto"/>
       </w:pPr>
       <w:r>
-        <w:t>Si los datos son correctos se saluda a la persona y su correo aparece en la barra de navegación.</w:t>
+        <w:t>Si los datos son correctos se saluda a la persona y su correo aparece en la barra de navegación de todas las páginas hasta que cierra sesión (botón «Cerrar sesión»).</w:t>
       </w:r>
     </w:p>
     <w:p>
@@ -4976,12 +4443,6 @@
         <w:gridCol w:w="3126"/>
       </w:tblGrid>
       <w:tr>
-        <w:tblPrEx>
-          <w:tblCellMar>
-            <w:top w:w="0" w:type="dxa"/>
-            <w:bottom w:w="0" w:type="dxa"/>
-          </w:tblCellMar>
-        </w:tblPrEx>
         <w:trPr>
           <w:cantSplit/>
         </w:trPr>
@@ -5117,12 +4578,6 @@
         </w:tc>
       </w:tr>
       <w:tr>
-        <w:tblPrEx>
-          <w:tblCellMar>
-            <w:top w:w="0" w:type="dxa"/>
-            <w:bottom w:w="0" w:type="dxa"/>
-          </w:tblCellMar>
-        </w:tblPrEx>
         <w:tc>
           <w:tcPr>
             <w:tcW w:w="5900" w:type="dxa"/>
@@ -5179,25 +4634,7 @@
                 <w:sz w:val="17"/>
                 <w:szCs w:val="17"/>
               </w:rPr>
-              <w:t xml:space="preserve">Móvil (390 </w:t>
-            </w:r>
-            <w:proofErr w:type="spellStart"/>
-            <w:r>
-              <w:rPr>
-                <w:color w:val="5B6572"/>
-                <w:sz w:val="17"/>
-                <w:szCs w:val="17"/>
-              </w:rPr>
-              <w:t>px</w:t>
-            </w:r>
-            <w:proofErr w:type="spellEnd"/>
-            <w:r>
-              <w:rPr>
-                <w:color w:val="5B6572"/>
-                <w:sz w:val="17"/>
-                <w:szCs w:val="17"/>
-              </w:rPr>
-              <w:t>)</w:t>
+              <w:t>Móvil (390 px)</w:t>
             </w:r>
           </w:p>
         </w:tc>
@@ -5234,7 +4671,7 @@
         <w:spacing w:after="120" w:line="300" w:lineRule="auto"/>
       </w:pPr>
       <w:r>
-        <w:t>Permite publicar una oferta o una petición y consultar el tablón completo.</w:t>
+        <w:t>Permite publicar una oferta o una petición y consultar todos los intercambios en una tabla.</w:t>
       </w:r>
     </w:p>
     <w:p>
@@ -5262,7 +4699,7 @@
         <w:spacing w:after="60" w:line="290" w:lineRule="auto"/>
       </w:pPr>
       <w:r>
-        <w:t>Filtros por tipo e idioma y buscador de texto que se combinan entre sí.</w:t>
+        <w:t>Tabla con tipo (etiqueta de texto y barra de color), título, idioma, nivel, modalidad y autor, con filtros por tipo e idioma y un buscador de texto que se combinan entre sí.</w:t>
       </w:r>
     </w:p>
     <w:p>
@@ -5276,7 +4713,7 @@
         <w:spacing w:after="60" w:line="290" w:lineRule="auto"/>
       </w:pPr>
       <w:r>
-        <w:t>Borrado con ventana de confirmación y mensaje cuando no hay resultados.</w:t>
+        <w:t>Baja con ventana de confirmación y mensaje cuando no hay resultados.</w:t>
       </w:r>
     </w:p>
     <w:tbl>
@@ -5301,12 +4738,6 @@
         <w:gridCol w:w="3126"/>
       </w:tblGrid>
       <w:tr>
-        <w:tblPrEx>
-          <w:tblCellMar>
-            <w:top w:w="0" w:type="dxa"/>
-            <w:bottom w:w="0" w:type="dxa"/>
-          </w:tblCellMar>
-        </w:tblPrEx>
         <w:trPr>
           <w:cantSplit/>
         </w:trPr>
@@ -5336,7 +4767,7 @@
               </w:rPr>
               <w:drawing>
                 <wp:inline distT="0" distB="0" distL="0" distR="0" wp14:anchorId="0636DC0B" wp14:editId="01A44E9E">
-                  <wp:extent cx="3038475" cy="3143250"/>
+                  <wp:extent cx="3215601" cy="3143250"/>
                   <wp:effectExtent l="0" t="0" r="0" b="0"/>
                   <wp:docPr id="944139098" name="/tmp/claude-0/-home-claude/791fb98e-0575-5ac2-8ab2-43197ce57a6b/scratchpad/memo/exchanges_pc.png" descr="/tmp/claude-0/-home-claude/791fb98e-0575-5ac2-8ab2-43197ce57a6b/scratchpad/memo/exchanges_pc.png" title="/tmp/claude-0/-home-claude/791fb98e-0575-5ac2-8ab2-43197ce57a6b/scratchpad/memo/exchanges_pc.png"/>
                   <wp:cNvGraphicFramePr>
@@ -5361,7 +4792,7 @@
                         <pic:spPr bwMode="auto">
                           <a:xfrm>
                             <a:off x="0" y="0"/>
-                            <a:ext cx="3038475" cy="3143250"/>
+                            <a:ext cx="3215601" cy="3143250"/>
                           </a:xfrm>
                           <a:prstGeom prst="rect">
                             <a:avLst/>
@@ -5401,7 +4832,7 @@
               </w:rPr>
               <w:drawing>
                 <wp:inline distT="0" distB="0" distL="0" distR="0" wp14:anchorId="1768B4DB" wp14:editId="26EEE48B">
-                  <wp:extent cx="581025" cy="3143250"/>
+                  <wp:extent cx="564655" cy="3143250"/>
                   <wp:effectExtent l="0" t="0" r="0" b="0"/>
                   <wp:docPr id="1825610010" name="/tmp/claude-0/-home-claude/791fb98e-0575-5ac2-8ab2-43197ce57a6b/scratchpad/memo/exchanges_movil.png" descr="/tmp/claude-0/-home-claude/791fb98e-0575-5ac2-8ab2-43197ce57a6b/scratchpad/memo/exchanges_movil.png" title="/tmp/claude-0/-home-claude/791fb98e-0575-5ac2-8ab2-43197ce57a6b/scratchpad/memo/exchanges_movil.png"/>
                   <wp:cNvGraphicFramePr>
@@ -5426,7 +4857,7 @@
                         <pic:spPr bwMode="auto">
                           <a:xfrm>
                             <a:off x="0" y="0"/>
-                            <a:ext cx="581025" cy="3143250"/>
+                            <a:ext cx="564655" cy="3143250"/>
                           </a:xfrm>
                           <a:prstGeom prst="rect">
                             <a:avLst/>
@@ -5442,12 +4873,6 @@
         </w:tc>
       </w:tr>
       <w:tr>
-        <w:tblPrEx>
-          <w:tblCellMar>
-            <w:top w:w="0" w:type="dxa"/>
-            <w:bottom w:w="0" w:type="dxa"/>
-          </w:tblCellMar>
-        </w:tblPrEx>
         <w:tc>
           <w:tcPr>
             <w:tcW w:w="5900" w:type="dxa"/>
@@ -5504,25 +4929,7 @@
                 <w:sz w:val="17"/>
                 <w:szCs w:val="17"/>
               </w:rPr>
-              <w:t xml:space="preserve">Móvil (390 </w:t>
-            </w:r>
-            <w:proofErr w:type="spellStart"/>
-            <w:r>
-              <w:rPr>
-                <w:color w:val="5B6572"/>
-                <w:sz w:val="17"/>
-                <w:szCs w:val="17"/>
-              </w:rPr>
-              <w:t>px</w:t>
-            </w:r>
-            <w:proofErr w:type="spellEnd"/>
-            <w:r>
-              <w:rPr>
-                <w:color w:val="5B6572"/>
-                <w:sz w:val="17"/>
-                <w:szCs w:val="17"/>
-              </w:rPr>
-              <w:t>)</w:t>
+              <w:t>Móvil (390 px)</w:t>
             </w:r>
           </w:p>
         </w:tc>
@@ -5626,12 +5033,6 @@
         <w:gridCol w:w="3126"/>
       </w:tblGrid>
       <w:tr>
-        <w:tblPrEx>
-          <w:tblCellMar>
-            <w:top w:w="0" w:type="dxa"/>
-            <w:bottom w:w="0" w:type="dxa"/>
-          </w:tblCellMar>
-        </w:tblPrEx>
         <w:trPr>
           <w:cantSplit/>
         </w:trPr>
@@ -5767,12 +5168,6 @@
         </w:tc>
       </w:tr>
       <w:tr>
-        <w:tblPrEx>
-          <w:tblCellMar>
-            <w:top w:w="0" w:type="dxa"/>
-            <w:bottom w:w="0" w:type="dxa"/>
-          </w:tblCellMar>
-        </w:tblPrEx>
         <w:tc>
           <w:tcPr>
             <w:tcW w:w="5900" w:type="dxa"/>
@@ -5829,25 +5224,7 @@
                 <w:sz w:val="17"/>
                 <w:szCs w:val="17"/>
               </w:rPr>
-              <w:t xml:space="preserve">Móvil (390 </w:t>
-            </w:r>
-            <w:proofErr w:type="spellStart"/>
-            <w:r>
-              <w:rPr>
-                <w:color w:val="5B6572"/>
-                <w:sz w:val="17"/>
-                <w:szCs w:val="17"/>
-              </w:rPr>
-              <w:t>px</w:t>
-            </w:r>
-            <w:proofErr w:type="spellEnd"/>
-            <w:r>
-              <w:rPr>
-                <w:color w:val="5B6572"/>
-                <w:sz w:val="17"/>
-                <w:szCs w:val="17"/>
-              </w:rPr>
-              <w:t>)</w:t>
+              <w:t>Móvil (390 px)</w:t>
             </w:r>
           </w:p>
         </w:tc>
@@ -5872,29 +5249,7 @@
           <w:sz w:val="30"/>
           <w:szCs w:val="30"/>
         </w:rPr>
-        <w:t xml:space="preserve">6. Arquitectura </w:t>
-      </w:r>
-      <w:proofErr w:type="spellStart"/>
-      <w:r>
-        <w:rPr>
-          <w:b/>
-          <w:bCs/>
-          <w:color w:val="1F3A5F"/>
-          <w:sz w:val="30"/>
-          <w:szCs w:val="30"/>
-        </w:rPr>
-        <w:t>frontend</w:t>
-      </w:r>
-      <w:proofErr w:type="spellEnd"/>
-      <w:r>
-        <w:rPr>
-          <w:b/>
-          <w:bCs/>
-          <w:color w:val="1F3A5F"/>
-          <w:sz w:val="30"/>
-          <w:szCs w:val="30"/>
-        </w:rPr>
-        <w:t xml:space="preserve"> y usabilidad</w:t>
+        <w:t>6. Arquitectura frontend y usabilidad</w:t>
       </w:r>
       <w:bookmarkEnd w:id="13"/>
     </w:p>
@@ -5913,21 +5268,9 @@
           <w:sz w:val="25"/>
           <w:szCs w:val="25"/>
         </w:rPr>
-        <w:t xml:space="preserve">Arquitectura </w:t>
-      </w:r>
-      <w:proofErr w:type="spellStart"/>
-      <w:r>
-        <w:rPr>
-          <w:b/>
-          <w:bCs/>
-          <w:color w:val="2F6FD0"/>
-          <w:sz w:val="25"/>
-          <w:szCs w:val="25"/>
-        </w:rPr>
-        <w:t>frontend</w:t>
+        <w:t>Arquitectura frontend</w:t>
       </w:r>
       <w:bookmarkEnd w:id="14"/>
-      <w:proofErr w:type="spellEnd"/>
     </w:p>
     <w:p>
       <w:pPr>
@@ -5963,23 +5306,7 @@
           <w:b/>
           <w:bCs/>
         </w:rPr>
-        <w:t xml:space="preserve">Aplicación </w:t>
-      </w:r>
-      <w:proofErr w:type="spellStart"/>
-      <w:r>
-        <w:rPr>
-          <w:b/>
-          <w:bCs/>
-        </w:rPr>
-        <w:t>multipágina</w:t>
-      </w:r>
-      <w:proofErr w:type="spellEnd"/>
-      <w:r>
-        <w:rPr>
-          <w:b/>
-          <w:bCs/>
-        </w:rPr>
-        <w:t xml:space="preserve"> (MPA). </w:t>
+        <w:t xml:space="preserve">Aplicación multipágina (MPA). </w:t>
       </w:r>
       <w:r>
         <w:t>Cada pantalla es un HTML distinto. Es lo contrario de una aplicación de una sola página (SPA), donde JavaScript cambia el contenido sin cargar otra página.</w:t>
@@ -6022,23 +5349,7 @@
         <w:t xml:space="preserve">Modularidad. </w:t>
       </w:r>
       <w:r>
-        <w:t>Los módulos ES (</w:t>
-      </w:r>
-      <w:proofErr w:type="spellStart"/>
-      <w:r>
-        <w:t>import</w:t>
-      </w:r>
-      <w:proofErr w:type="spellEnd"/>
-      <w:r>
-        <w:t>/</w:t>
-      </w:r>
-      <w:proofErr w:type="spellStart"/>
-      <w:r>
-        <w:t>export</w:t>
-      </w:r>
-      <w:proofErr w:type="spellEnd"/>
-      <w:r>
-        <w:t>) permiten compartir datos y funciones entre pantallas sin duplicar código.</w:t>
+        <w:t>Los módulos ES (import/export) permiten compartir datos y funciones entre pantallas sin duplicar código.</w:t>
       </w:r>
     </w:p>
     <w:p>
@@ -6055,50 +5366,10 @@
           <w:b/>
           <w:bCs/>
         </w:rPr>
-        <w:t xml:space="preserve">Diseño responsive y </w:t>
-      </w:r>
-      <w:proofErr w:type="spellStart"/>
-      <w:r>
-        <w:rPr>
-          <w:b/>
-          <w:bCs/>
-        </w:rPr>
-        <w:t>mobile</w:t>
-      </w:r>
-      <w:proofErr w:type="spellEnd"/>
-      <w:r>
-        <w:rPr>
-          <w:b/>
-          <w:bCs/>
-        </w:rPr>
-        <w:t xml:space="preserve"> </w:t>
-      </w:r>
-      <w:proofErr w:type="spellStart"/>
-      <w:r>
-        <w:rPr>
-          <w:b/>
-          <w:bCs/>
-        </w:rPr>
-        <w:t>first</w:t>
-      </w:r>
-      <w:proofErr w:type="spellEnd"/>
-      <w:r>
-        <w:rPr>
-          <w:b/>
-          <w:bCs/>
-        </w:rPr>
-        <w:t xml:space="preserve">. </w:t>
+        <w:t xml:space="preserve">Diseño responsive y mobile first. </w:t>
       </w:r>
       <w:r>
-        <w:t xml:space="preserve">La rejilla de Bootstrap y sus puntos de ruptura adaptan la interfaz a móvil, </w:t>
-      </w:r>
-      <w:proofErr w:type="spellStart"/>
-      <w:r>
-        <w:t>tablet</w:t>
-      </w:r>
-      <w:proofErr w:type="spellEnd"/>
-      <w:r>
-        <w:t xml:space="preserve"> y escritorio.</w:t>
+        <w:t>La rejilla de Bootstrap y sus puntos de ruptura adaptan la interfaz a móvil, tablet y escritorio.</w:t>
       </w:r>
     </w:p>
     <w:p>
@@ -6190,21 +5461,12 @@
         </w:numPr>
         <w:spacing w:after="60" w:line="290" w:lineRule="auto"/>
       </w:pPr>
-      <w:proofErr w:type="gramStart"/>
       <w:r>
         <w:rPr>
           <w:b/>
           <w:bCs/>
         </w:rPr>
-        <w:t>Reconocer</w:t>
-      </w:r>
-      <w:proofErr w:type="gramEnd"/>
-      <w:r>
-        <w:rPr>
-          <w:b/>
-          <w:bCs/>
-        </w:rPr>
-        <w:t xml:space="preserve"> antes que recordar: </w:t>
+        <w:t xml:space="preserve">Reconocer antes que recordar: </w:t>
       </w:r>
       <w:r>
         <w:t>etiquetas visibles en todos los campos y menús claros.</w:t>
@@ -6227,15 +5489,7 @@
         <w:t xml:space="preserve">Accesibilidad: </w:t>
       </w:r>
       <w:r>
-        <w:t xml:space="preserve">oferta y petición no se distinguen solo por el color, buen contraste (WCAG AA) y respeto a </w:t>
-      </w:r>
-      <w:proofErr w:type="spellStart"/>
-      <w:r>
-        <w:t>prefers-reduced-motion</w:t>
-      </w:r>
-      <w:proofErr w:type="spellEnd"/>
-      <w:r>
-        <w:t>.</w:t>
+        <w:t>oferta y petición no se distinguen solo por el color, buen contraste (WCAG AA) y respeto a prefers-reduced-motion.</w:t>
       </w:r>
     </w:p>
     <w:p>
@@ -6279,12 +5533,6 @@
         <w:gridCol w:w="3426"/>
       </w:tblGrid>
       <w:tr>
-        <w:tblPrEx>
-          <w:tblCellMar>
-            <w:top w:w="0" w:type="dxa"/>
-            <w:bottom w:w="0" w:type="dxa"/>
-          </w:tblCellMar>
-        </w:tblPrEx>
         <w:trPr>
           <w:tblHeader/>
         </w:trPr>
@@ -6356,12 +5604,6 @@
         </w:tc>
       </w:tr>
       <w:tr>
-        <w:tblPrEx>
-          <w:tblCellMar>
-            <w:top w:w="0" w:type="dxa"/>
-            <w:bottom w:w="0" w:type="dxa"/>
-          </w:tblCellMar>
-        </w:tblPrEx>
         <w:trPr>
           <w:cantSplit/>
         </w:trPr>
@@ -6391,64 +5633,42 @@
                 <w:sz w:val="18"/>
                 <w:szCs w:val="18"/>
               </w:rPr>
-              <w:t xml:space="preserve">Mozilla. MDN Web </w:t>
-            </w:r>
-            <w:proofErr w:type="spellStart"/>
+              <w:t>Mozilla. MDN Web Docs: referencia de HTML, CSS y JavaScript (módulos ES).</w:t>
+            </w:r>
+          </w:p>
+        </w:tc>
+        <w:tc>
+          <w:tcPr>
+            <w:tcW w:w="3426" w:type="dxa"/>
+            <w:tcBorders>
+              <w:top w:val="single" w:sz="4" w:space="0" w:color="C9D1DC"/>
+              <w:left w:val="single" w:sz="4" w:space="0" w:color="C9D1DC"/>
+              <w:bottom w:val="single" w:sz="4" w:space="0" w:color="C9D1DC"/>
+              <w:right w:val="single" w:sz="4" w:space="0" w:color="C9D1DC"/>
+            </w:tcBorders>
+            <w:shd w:val="clear" w:color="auto" w:fill="FFFFFF"/>
+            <w:tcMar>
+              <w:top w:w="60" w:type="dxa"/>
+              <w:left w:w="100" w:type="dxa"/>
+              <w:bottom w:w="60" w:type="dxa"/>
+              <w:right w:w="100" w:type="dxa"/>
+            </w:tcMar>
+          </w:tcPr>
+          <w:p>
+            <w:pPr>
+              <w:spacing w:after="40" w:line="260" w:lineRule="auto"/>
+            </w:pPr>
             <w:r>
               <w:rPr>
                 <w:sz w:val="18"/>
                 <w:szCs w:val="18"/>
               </w:rPr>
-              <w:t>Docs</w:t>
-            </w:r>
-            <w:proofErr w:type="spellEnd"/>
-            <w:r>
-              <w:rPr>
-                <w:sz w:val="18"/>
-                <w:szCs w:val="18"/>
-              </w:rPr>
-              <w:t>: referencia de HTML, CSS y JavaScript (módulos ES).</w:t>
-            </w:r>
-          </w:p>
-        </w:tc>
-        <w:tc>
-          <w:tcPr>
-            <w:tcW w:w="3426" w:type="dxa"/>
-            <w:tcBorders>
-              <w:top w:val="single" w:sz="4" w:space="0" w:color="C9D1DC"/>
-              <w:left w:val="single" w:sz="4" w:space="0" w:color="C9D1DC"/>
-              <w:bottom w:val="single" w:sz="4" w:space="0" w:color="C9D1DC"/>
-              <w:right w:val="single" w:sz="4" w:space="0" w:color="C9D1DC"/>
-            </w:tcBorders>
-            <w:shd w:val="clear" w:color="auto" w:fill="FFFFFF"/>
-            <w:tcMar>
-              <w:top w:w="60" w:type="dxa"/>
-              <w:left w:w="100" w:type="dxa"/>
-              <w:bottom w:w="60" w:type="dxa"/>
-              <w:right w:w="100" w:type="dxa"/>
-            </w:tcMar>
-          </w:tcPr>
-          <w:p>
-            <w:pPr>
-              <w:spacing w:after="40" w:line="260" w:lineRule="auto"/>
-            </w:pPr>
-            <w:r>
-              <w:rPr>
-                <w:sz w:val="18"/>
-                <w:szCs w:val="18"/>
-              </w:rPr>
               <w:t>https://developer.mozilla.org</w:t>
             </w:r>
           </w:p>
         </w:tc>
       </w:tr>
       <w:tr>
-        <w:tblPrEx>
-          <w:tblCellMar>
-            <w:top w:w="0" w:type="dxa"/>
-            <w:bottom w:w="0" w:type="dxa"/>
-          </w:tblCellMar>
-        </w:tblPrEx>
         <w:trPr>
           <w:cantSplit/>
         </w:trPr>
@@ -6514,12 +5734,6 @@
         </w:tc>
       </w:tr>
       <w:tr>
-        <w:tblPrEx>
-          <w:tblCellMar>
-            <w:top w:w="0" w:type="dxa"/>
-            <w:bottom w:w="0" w:type="dxa"/>
-          </w:tblCellMar>
-        </w:tblPrEx>
         <w:trPr>
           <w:cantSplit/>
         </w:trPr>
@@ -6549,144 +5763,42 @@
                 <w:sz w:val="18"/>
                 <w:szCs w:val="18"/>
               </w:rPr>
-              <w:t xml:space="preserve">Nielsen Norman Group. «10 </w:t>
-            </w:r>
-            <w:proofErr w:type="spellStart"/>
+              <w:t>Nielsen Norman Group. «10 Usability Heuristics for User Interface Design».</w:t>
+            </w:r>
+          </w:p>
+        </w:tc>
+        <w:tc>
+          <w:tcPr>
+            <w:tcW w:w="3426" w:type="dxa"/>
+            <w:tcBorders>
+              <w:top w:val="single" w:sz="4" w:space="0" w:color="C9D1DC"/>
+              <w:left w:val="single" w:sz="4" w:space="0" w:color="C9D1DC"/>
+              <w:bottom w:val="single" w:sz="4" w:space="0" w:color="C9D1DC"/>
+              <w:right w:val="single" w:sz="4" w:space="0" w:color="C9D1DC"/>
+            </w:tcBorders>
+            <w:shd w:val="clear" w:color="auto" w:fill="FFFFFF"/>
+            <w:tcMar>
+              <w:top w:w="60" w:type="dxa"/>
+              <w:left w:w="100" w:type="dxa"/>
+              <w:bottom w:w="60" w:type="dxa"/>
+              <w:right w:w="100" w:type="dxa"/>
+            </w:tcMar>
+          </w:tcPr>
+          <w:p>
+            <w:pPr>
+              <w:spacing w:after="40" w:line="260" w:lineRule="auto"/>
+            </w:pPr>
             <w:r>
               <w:rPr>
                 <w:sz w:val="18"/>
                 <w:szCs w:val="18"/>
               </w:rPr>
-              <w:t>Usability</w:t>
-            </w:r>
-            <w:proofErr w:type="spellEnd"/>
-            <w:r>
-              <w:rPr>
-                <w:sz w:val="18"/>
-                <w:szCs w:val="18"/>
-              </w:rPr>
-              <w:t xml:space="preserve"> </w:t>
-            </w:r>
-            <w:proofErr w:type="spellStart"/>
-            <w:r>
-              <w:rPr>
-                <w:sz w:val="18"/>
-                <w:szCs w:val="18"/>
-              </w:rPr>
-              <w:t>Heuristics</w:t>
-            </w:r>
-            <w:proofErr w:type="spellEnd"/>
-            <w:r>
-              <w:rPr>
-                <w:sz w:val="18"/>
-                <w:szCs w:val="18"/>
-              </w:rPr>
-              <w:t xml:space="preserve"> </w:t>
-            </w:r>
-            <w:proofErr w:type="spellStart"/>
-            <w:r>
-              <w:rPr>
-                <w:sz w:val="18"/>
-                <w:szCs w:val="18"/>
-              </w:rPr>
-              <w:t>for</w:t>
-            </w:r>
-            <w:proofErr w:type="spellEnd"/>
-            <w:r>
-              <w:rPr>
-                <w:sz w:val="18"/>
-                <w:szCs w:val="18"/>
-              </w:rPr>
-              <w:t xml:space="preserve"> </w:t>
-            </w:r>
-            <w:proofErr w:type="spellStart"/>
-            <w:r>
-              <w:rPr>
-                <w:sz w:val="18"/>
-                <w:szCs w:val="18"/>
-              </w:rPr>
-              <w:t>User</w:t>
-            </w:r>
-            <w:proofErr w:type="spellEnd"/>
-            <w:r>
-              <w:rPr>
-                <w:sz w:val="18"/>
-                <w:szCs w:val="18"/>
-              </w:rPr>
-              <w:t xml:space="preserve"> </w:t>
-            </w:r>
-            <w:proofErr w:type="gramStart"/>
-            <w:r>
-              <w:rPr>
-                <w:sz w:val="18"/>
-                <w:szCs w:val="18"/>
-              </w:rPr>
-              <w:t>Interface</w:t>
-            </w:r>
-            <w:proofErr w:type="gramEnd"/>
-            <w:r>
-              <w:rPr>
-                <w:sz w:val="18"/>
-                <w:szCs w:val="18"/>
-              </w:rPr>
-              <w:t xml:space="preserve"> </w:t>
-            </w:r>
-            <w:proofErr w:type="spellStart"/>
-            <w:r>
-              <w:rPr>
-                <w:sz w:val="18"/>
-                <w:szCs w:val="18"/>
-              </w:rPr>
-              <w:t>Design</w:t>
-            </w:r>
-            <w:proofErr w:type="spellEnd"/>
-            <w:r>
-              <w:rPr>
-                <w:sz w:val="18"/>
-                <w:szCs w:val="18"/>
-              </w:rPr>
-              <w:t>».</w:t>
-            </w:r>
-          </w:p>
-        </w:tc>
-        <w:tc>
-          <w:tcPr>
-            <w:tcW w:w="3426" w:type="dxa"/>
-            <w:tcBorders>
-              <w:top w:val="single" w:sz="4" w:space="0" w:color="C9D1DC"/>
-              <w:left w:val="single" w:sz="4" w:space="0" w:color="C9D1DC"/>
-              <w:bottom w:val="single" w:sz="4" w:space="0" w:color="C9D1DC"/>
-              <w:right w:val="single" w:sz="4" w:space="0" w:color="C9D1DC"/>
-            </w:tcBorders>
-            <w:shd w:val="clear" w:color="auto" w:fill="FFFFFF"/>
-            <w:tcMar>
-              <w:top w:w="60" w:type="dxa"/>
-              <w:left w:w="100" w:type="dxa"/>
-              <w:bottom w:w="60" w:type="dxa"/>
-              <w:right w:w="100" w:type="dxa"/>
-            </w:tcMar>
-          </w:tcPr>
-          <w:p>
-            <w:pPr>
-              <w:spacing w:after="40" w:line="260" w:lineRule="auto"/>
-            </w:pPr>
-            <w:r>
-              <w:rPr>
-                <w:sz w:val="18"/>
-                <w:szCs w:val="18"/>
-              </w:rPr>
               <w:t>https://www.nngroup.com/articles/ten-usability-heuristics/</w:t>
             </w:r>
           </w:p>
         </w:tc>
       </w:tr>
       <w:tr>
-        <w:tblPrEx>
-          <w:tblCellMar>
-            <w:top w:w="0" w:type="dxa"/>
-            <w:bottom w:w="0" w:type="dxa"/>
-          </w:tblCellMar>
-        </w:tblPrEx>
         <w:trPr>
           <w:cantSplit/>
         </w:trPr>
@@ -6716,96 +5828,42 @@
                 <w:sz w:val="18"/>
                 <w:szCs w:val="18"/>
               </w:rPr>
-              <w:t xml:space="preserve">W3C Web </w:t>
-            </w:r>
-            <w:proofErr w:type="spellStart"/>
+              <w:t>W3C Web Accessibility Initiative. «WCAG 2 Overview».</w:t>
+            </w:r>
+          </w:p>
+        </w:tc>
+        <w:tc>
+          <w:tcPr>
+            <w:tcW w:w="3426" w:type="dxa"/>
+            <w:tcBorders>
+              <w:top w:val="single" w:sz="4" w:space="0" w:color="C9D1DC"/>
+              <w:left w:val="single" w:sz="4" w:space="0" w:color="C9D1DC"/>
+              <w:bottom w:val="single" w:sz="4" w:space="0" w:color="C9D1DC"/>
+              <w:right w:val="single" w:sz="4" w:space="0" w:color="C9D1DC"/>
+            </w:tcBorders>
+            <w:shd w:val="clear" w:color="auto" w:fill="F3F5F8"/>
+            <w:tcMar>
+              <w:top w:w="60" w:type="dxa"/>
+              <w:left w:w="100" w:type="dxa"/>
+              <w:bottom w:w="60" w:type="dxa"/>
+              <w:right w:w="100" w:type="dxa"/>
+            </w:tcMar>
+          </w:tcPr>
+          <w:p>
+            <w:pPr>
+              <w:spacing w:after="40" w:line="260" w:lineRule="auto"/>
+            </w:pPr>
             <w:r>
               <w:rPr>
                 <w:sz w:val="18"/>
                 <w:szCs w:val="18"/>
               </w:rPr>
-              <w:t>Accessibility</w:t>
-            </w:r>
-            <w:proofErr w:type="spellEnd"/>
-            <w:r>
-              <w:rPr>
-                <w:sz w:val="18"/>
-                <w:szCs w:val="18"/>
-              </w:rPr>
-              <w:t xml:space="preserve"> </w:t>
-            </w:r>
-            <w:proofErr w:type="spellStart"/>
-            <w:r>
-              <w:rPr>
-                <w:sz w:val="18"/>
-                <w:szCs w:val="18"/>
-              </w:rPr>
-              <w:t>Initiative</w:t>
-            </w:r>
-            <w:proofErr w:type="spellEnd"/>
-            <w:r>
-              <w:rPr>
-                <w:sz w:val="18"/>
-                <w:szCs w:val="18"/>
-              </w:rPr>
-              <w:t xml:space="preserve">. «WCAG 2 </w:t>
-            </w:r>
-            <w:proofErr w:type="spellStart"/>
-            <w:r>
-              <w:rPr>
-                <w:sz w:val="18"/>
-                <w:szCs w:val="18"/>
-              </w:rPr>
-              <w:t>Overview</w:t>
-            </w:r>
-            <w:proofErr w:type="spellEnd"/>
-            <w:r>
-              <w:rPr>
-                <w:sz w:val="18"/>
-                <w:szCs w:val="18"/>
-              </w:rPr>
-              <w:t>».</w:t>
-            </w:r>
-          </w:p>
-        </w:tc>
-        <w:tc>
-          <w:tcPr>
-            <w:tcW w:w="3426" w:type="dxa"/>
-            <w:tcBorders>
-              <w:top w:val="single" w:sz="4" w:space="0" w:color="C9D1DC"/>
-              <w:left w:val="single" w:sz="4" w:space="0" w:color="C9D1DC"/>
-              <w:bottom w:val="single" w:sz="4" w:space="0" w:color="C9D1DC"/>
-              <w:right w:val="single" w:sz="4" w:space="0" w:color="C9D1DC"/>
-            </w:tcBorders>
-            <w:shd w:val="clear" w:color="auto" w:fill="F3F5F8"/>
-            <w:tcMar>
-              <w:top w:w="60" w:type="dxa"/>
-              <w:left w:w="100" w:type="dxa"/>
-              <w:bottom w:w="60" w:type="dxa"/>
-              <w:right w:w="100" w:type="dxa"/>
-            </w:tcMar>
-          </w:tcPr>
-          <w:p>
-            <w:pPr>
-              <w:spacing w:after="40" w:line="260" w:lineRule="auto"/>
-            </w:pPr>
-            <w:r>
-              <w:rPr>
-                <w:sz w:val="18"/>
-                <w:szCs w:val="18"/>
-              </w:rPr>
               <w:t>https://www.w3.org/WAI/standards-guidelines/wcag/</w:t>
             </w:r>
           </w:p>
         </w:tc>
       </w:tr>
       <w:tr>
-        <w:tblPrEx>
-          <w:tblCellMar>
-            <w:top w:w="0" w:type="dxa"/>
-            <w:bottom w:w="0" w:type="dxa"/>
-          </w:tblCellMar>
-        </w:tblPrEx>
         <w:trPr>
           <w:cantSplit/>
         </w:trPr>
@@ -6830,78 +5888,47 @@
             <w:pPr>
               <w:spacing w:after="40" w:line="260" w:lineRule="auto"/>
             </w:pPr>
-            <w:proofErr w:type="spellStart"/>
             <w:r>
               <w:rPr>
                 <w:sz w:val="18"/>
                 <w:szCs w:val="18"/>
               </w:rPr>
-              <w:t>Chacon</w:t>
-            </w:r>
-            <w:proofErr w:type="spellEnd"/>
+              <w:t>Chacon, S. y Straub, B. Pro Git.</w:t>
+            </w:r>
+          </w:p>
+        </w:tc>
+        <w:tc>
+          <w:tcPr>
+            <w:tcW w:w="3426" w:type="dxa"/>
+            <w:tcBorders>
+              <w:top w:val="single" w:sz="4" w:space="0" w:color="C9D1DC"/>
+              <w:left w:val="single" w:sz="4" w:space="0" w:color="C9D1DC"/>
+              <w:bottom w:val="single" w:sz="4" w:space="0" w:color="C9D1DC"/>
+              <w:right w:val="single" w:sz="4" w:space="0" w:color="C9D1DC"/>
+            </w:tcBorders>
+            <w:shd w:val="clear" w:color="auto" w:fill="FFFFFF"/>
+            <w:tcMar>
+              <w:top w:w="60" w:type="dxa"/>
+              <w:left w:w="100" w:type="dxa"/>
+              <w:bottom w:w="60" w:type="dxa"/>
+              <w:right w:w="100" w:type="dxa"/>
+            </w:tcMar>
+          </w:tcPr>
+          <w:p>
+            <w:pPr>
+              <w:spacing w:after="40" w:line="260" w:lineRule="auto"/>
+            </w:pPr>
             <w:r>
               <w:rPr>
                 <w:sz w:val="18"/>
                 <w:szCs w:val="18"/>
               </w:rPr>
-              <w:t xml:space="preserve">, S. y Straub, B. </w:t>
-            </w:r>
-            <w:proofErr w:type="gramStart"/>
-            <w:r>
-              <w:rPr>
-                <w:sz w:val="18"/>
-                <w:szCs w:val="18"/>
-              </w:rPr>
-              <w:t>Pro Git</w:t>
-            </w:r>
-            <w:proofErr w:type="gramEnd"/>
-            <w:r>
-              <w:rPr>
-                <w:sz w:val="18"/>
-                <w:szCs w:val="18"/>
-              </w:rPr>
-              <w:t>.</w:t>
-            </w:r>
-          </w:p>
-        </w:tc>
-        <w:tc>
-          <w:tcPr>
-            <w:tcW w:w="3426" w:type="dxa"/>
-            <w:tcBorders>
-              <w:top w:val="single" w:sz="4" w:space="0" w:color="C9D1DC"/>
-              <w:left w:val="single" w:sz="4" w:space="0" w:color="C9D1DC"/>
-              <w:bottom w:val="single" w:sz="4" w:space="0" w:color="C9D1DC"/>
-              <w:right w:val="single" w:sz="4" w:space="0" w:color="C9D1DC"/>
-            </w:tcBorders>
-            <w:shd w:val="clear" w:color="auto" w:fill="FFFFFF"/>
-            <w:tcMar>
-              <w:top w:w="60" w:type="dxa"/>
-              <w:left w:w="100" w:type="dxa"/>
-              <w:bottom w:w="60" w:type="dxa"/>
-              <w:right w:w="100" w:type="dxa"/>
-            </w:tcMar>
-          </w:tcPr>
-          <w:p>
-            <w:pPr>
-              <w:spacing w:after="40" w:line="260" w:lineRule="auto"/>
-            </w:pPr>
-            <w:r>
-              <w:rPr>
-                <w:sz w:val="18"/>
-                <w:szCs w:val="18"/>
-              </w:rPr>
               <w:t>https://git-scm.com/book</w:t>
             </w:r>
           </w:p>
         </w:tc>
       </w:tr>
       <w:tr>
-        <w:tblPrEx>
-          <w:tblCellMar>
-            <w:top w:w="0" w:type="dxa"/>
-            <w:bottom w:w="0" w:type="dxa"/>
-          </w:tblCellMar>
-        </w:tblPrEx>
         <w:trPr>
           <w:cantSplit/>
         </w:trPr>
@@ -6931,112 +5958,42 @@
                 <w:sz w:val="18"/>
                 <w:szCs w:val="18"/>
               </w:rPr>
-              <w:t xml:space="preserve">Driessen, V. «A </w:t>
-            </w:r>
-            <w:proofErr w:type="spellStart"/>
+              <w:t>Driessen, V. «A successful Git branching model» (Gitflow).</w:t>
+            </w:r>
+          </w:p>
+        </w:tc>
+        <w:tc>
+          <w:tcPr>
+            <w:tcW w:w="3426" w:type="dxa"/>
+            <w:tcBorders>
+              <w:top w:val="single" w:sz="4" w:space="0" w:color="C9D1DC"/>
+              <w:left w:val="single" w:sz="4" w:space="0" w:color="C9D1DC"/>
+              <w:bottom w:val="single" w:sz="4" w:space="0" w:color="C9D1DC"/>
+              <w:right w:val="single" w:sz="4" w:space="0" w:color="C9D1DC"/>
+            </w:tcBorders>
+            <w:shd w:val="clear" w:color="auto" w:fill="F3F5F8"/>
+            <w:tcMar>
+              <w:top w:w="60" w:type="dxa"/>
+              <w:left w:w="100" w:type="dxa"/>
+              <w:bottom w:w="60" w:type="dxa"/>
+              <w:right w:w="100" w:type="dxa"/>
+            </w:tcMar>
+          </w:tcPr>
+          <w:p>
+            <w:pPr>
+              <w:spacing w:after="40" w:line="260" w:lineRule="auto"/>
+            </w:pPr>
             <w:r>
               <w:rPr>
                 <w:sz w:val="18"/>
                 <w:szCs w:val="18"/>
               </w:rPr>
-              <w:t>successful</w:t>
-            </w:r>
-            <w:proofErr w:type="spellEnd"/>
-            <w:r>
-              <w:rPr>
-                <w:sz w:val="18"/>
-                <w:szCs w:val="18"/>
-              </w:rPr>
-              <w:t xml:space="preserve"> Git </w:t>
-            </w:r>
-            <w:proofErr w:type="spellStart"/>
-            <w:r>
-              <w:rPr>
-                <w:sz w:val="18"/>
-                <w:szCs w:val="18"/>
-              </w:rPr>
-              <w:t>branching</w:t>
-            </w:r>
-            <w:proofErr w:type="spellEnd"/>
-            <w:r>
-              <w:rPr>
-                <w:sz w:val="18"/>
-                <w:szCs w:val="18"/>
-              </w:rPr>
-              <w:t xml:space="preserve"> </w:t>
-            </w:r>
-            <w:proofErr w:type="spellStart"/>
-            <w:r>
-              <w:rPr>
-                <w:sz w:val="18"/>
-                <w:szCs w:val="18"/>
-              </w:rPr>
-              <w:t>model</w:t>
-            </w:r>
-            <w:proofErr w:type="spellEnd"/>
-            <w:r>
-              <w:rPr>
-                <w:sz w:val="18"/>
-                <w:szCs w:val="18"/>
-              </w:rPr>
-              <w:t>» (</w:t>
-            </w:r>
-            <w:proofErr w:type="spellStart"/>
-            <w:r>
-              <w:rPr>
-                <w:sz w:val="18"/>
-                <w:szCs w:val="18"/>
-              </w:rPr>
-              <w:t>Gitflow</w:t>
-            </w:r>
-            <w:proofErr w:type="spellEnd"/>
-            <w:r>
-              <w:rPr>
-                <w:sz w:val="18"/>
-                <w:szCs w:val="18"/>
-              </w:rPr>
-              <w:t>).</w:t>
-            </w:r>
-          </w:p>
-        </w:tc>
-        <w:tc>
-          <w:tcPr>
-            <w:tcW w:w="3426" w:type="dxa"/>
-            <w:tcBorders>
-              <w:top w:val="single" w:sz="4" w:space="0" w:color="C9D1DC"/>
-              <w:left w:val="single" w:sz="4" w:space="0" w:color="C9D1DC"/>
-              <w:bottom w:val="single" w:sz="4" w:space="0" w:color="C9D1DC"/>
-              <w:right w:val="single" w:sz="4" w:space="0" w:color="C9D1DC"/>
-            </w:tcBorders>
-            <w:shd w:val="clear" w:color="auto" w:fill="F3F5F8"/>
-            <w:tcMar>
-              <w:top w:w="60" w:type="dxa"/>
-              <w:left w:w="100" w:type="dxa"/>
-              <w:bottom w:w="60" w:type="dxa"/>
-              <w:right w:w="100" w:type="dxa"/>
-            </w:tcMar>
-          </w:tcPr>
-          <w:p>
-            <w:pPr>
-              <w:spacing w:after="40" w:line="260" w:lineRule="auto"/>
-            </w:pPr>
-            <w:r>
-              <w:rPr>
-                <w:sz w:val="18"/>
-                <w:szCs w:val="18"/>
-              </w:rPr>
               <w:t>https://nvie.com/posts/a-successful-git-branching-model/</w:t>
             </w:r>
           </w:p>
         </w:tc>
       </w:tr>
       <w:tr>
-        <w:tblPrEx>
-          <w:tblCellMar>
-            <w:top w:w="0" w:type="dxa"/>
-            <w:bottom w:w="0" w:type="dxa"/>
-          </w:tblCellMar>
-        </w:tblPrEx>
         <w:trPr>
           <w:cantSplit/>
         </w:trPr>
@@ -7066,80 +6023,42 @@
                 <w:sz w:val="18"/>
                 <w:szCs w:val="18"/>
               </w:rPr>
-              <w:t xml:space="preserve">Cisco </w:t>
-            </w:r>
-            <w:proofErr w:type="spellStart"/>
+              <w:t>Cisco Networking Academy. Curso «JavaScript Essentials».</w:t>
+            </w:r>
+          </w:p>
+        </w:tc>
+        <w:tc>
+          <w:tcPr>
+            <w:tcW w:w="3426" w:type="dxa"/>
+            <w:tcBorders>
+              <w:top w:val="single" w:sz="4" w:space="0" w:color="C9D1DC"/>
+              <w:left w:val="single" w:sz="4" w:space="0" w:color="C9D1DC"/>
+              <w:bottom w:val="single" w:sz="4" w:space="0" w:color="C9D1DC"/>
+              <w:right w:val="single" w:sz="4" w:space="0" w:color="C9D1DC"/>
+            </w:tcBorders>
+            <w:shd w:val="clear" w:color="auto" w:fill="FFFFFF"/>
+            <w:tcMar>
+              <w:top w:w="60" w:type="dxa"/>
+              <w:left w:w="100" w:type="dxa"/>
+              <w:bottom w:w="60" w:type="dxa"/>
+              <w:right w:w="100" w:type="dxa"/>
+            </w:tcMar>
+          </w:tcPr>
+          <w:p>
+            <w:pPr>
+              <w:spacing w:after="40" w:line="260" w:lineRule="auto"/>
+            </w:pPr>
             <w:r>
               <w:rPr>
                 <w:sz w:val="18"/>
                 <w:szCs w:val="18"/>
               </w:rPr>
-              <w:t>Networking</w:t>
-            </w:r>
-            <w:proofErr w:type="spellEnd"/>
-            <w:r>
-              <w:rPr>
-                <w:sz w:val="18"/>
-                <w:szCs w:val="18"/>
-              </w:rPr>
-              <w:t xml:space="preserve"> </w:t>
-            </w:r>
-            <w:proofErr w:type="spellStart"/>
-            <w:r>
-              <w:rPr>
-                <w:sz w:val="18"/>
-                <w:szCs w:val="18"/>
-              </w:rPr>
-              <w:t>Academy</w:t>
-            </w:r>
-            <w:proofErr w:type="spellEnd"/>
-            <w:r>
-              <w:rPr>
-                <w:sz w:val="18"/>
-                <w:szCs w:val="18"/>
-              </w:rPr>
-              <w:t>. Curso «JavaScript Essentials».</w:t>
-            </w:r>
-          </w:p>
-        </w:tc>
-        <w:tc>
-          <w:tcPr>
-            <w:tcW w:w="3426" w:type="dxa"/>
-            <w:tcBorders>
-              <w:top w:val="single" w:sz="4" w:space="0" w:color="C9D1DC"/>
-              <w:left w:val="single" w:sz="4" w:space="0" w:color="C9D1DC"/>
-              <w:bottom w:val="single" w:sz="4" w:space="0" w:color="C9D1DC"/>
-              <w:right w:val="single" w:sz="4" w:space="0" w:color="C9D1DC"/>
-            </w:tcBorders>
-            <w:shd w:val="clear" w:color="auto" w:fill="FFFFFF"/>
-            <w:tcMar>
-              <w:top w:w="60" w:type="dxa"/>
-              <w:left w:w="100" w:type="dxa"/>
-              <w:bottom w:w="60" w:type="dxa"/>
-              <w:right w:w="100" w:type="dxa"/>
-            </w:tcMar>
-          </w:tcPr>
-          <w:p>
-            <w:pPr>
-              <w:spacing w:after="40" w:line="260" w:lineRule="auto"/>
-            </w:pPr>
-            <w:r>
-              <w:rPr>
-                <w:sz w:val="18"/>
-                <w:szCs w:val="18"/>
-              </w:rPr>
               <w:t>https://www.netacad.com</w:t>
             </w:r>
           </w:p>
         </w:tc>
       </w:tr>
       <w:tr>
-        <w:tblPrEx>
-          <w:tblCellMar>
-            <w:top w:w="0" w:type="dxa"/>
-            <w:bottom w:w="0" w:type="dxa"/>
-          </w:tblCellMar>
-        </w:tblPrEx>
         <w:trPr>
           <w:cantSplit/>
         </w:trPr>
@@ -7169,55 +6088,7 @@
                 <w:sz w:val="18"/>
                 <w:szCs w:val="18"/>
               </w:rPr>
-              <w:t xml:space="preserve">Microsoft </w:t>
-            </w:r>
-            <w:proofErr w:type="spellStart"/>
-            <w:r>
-              <w:rPr>
-                <w:sz w:val="18"/>
-                <w:szCs w:val="18"/>
-              </w:rPr>
-              <w:t>Developer</w:t>
-            </w:r>
-            <w:proofErr w:type="spellEnd"/>
-            <w:r>
-              <w:rPr>
-                <w:sz w:val="18"/>
-                <w:szCs w:val="18"/>
-              </w:rPr>
-              <w:t xml:space="preserve">. Serie de vídeos «JavaScript </w:t>
-            </w:r>
-            <w:proofErr w:type="spellStart"/>
-            <w:r>
-              <w:rPr>
-                <w:sz w:val="18"/>
-                <w:szCs w:val="18"/>
-              </w:rPr>
-              <w:t>for</w:t>
-            </w:r>
-            <w:proofErr w:type="spellEnd"/>
-            <w:r>
-              <w:rPr>
-                <w:sz w:val="18"/>
-                <w:szCs w:val="18"/>
-              </w:rPr>
-              <w:t xml:space="preserve"> </w:t>
-            </w:r>
-            <w:proofErr w:type="spellStart"/>
-            <w:r>
-              <w:rPr>
-                <w:sz w:val="18"/>
-                <w:szCs w:val="18"/>
-              </w:rPr>
-              <w:t>Beginners</w:t>
-            </w:r>
-            <w:proofErr w:type="spellEnd"/>
-            <w:r>
-              <w:rPr>
-                <w:sz w:val="18"/>
-                <w:szCs w:val="18"/>
-              </w:rPr>
-              <w:t>».</w:t>
+              <w:t>Microsoft Developer. Serie de vídeos «JavaScript for Beginners».</w:t>
             </w:r>
           </w:p>
         </w:tc>
@@ -7267,29 +6138,7 @@
           <w:sz w:val="30"/>
           <w:szCs w:val="30"/>
         </w:rPr>
-        <w:t xml:space="preserve">7. </w:t>
-      </w:r>
-      <w:proofErr w:type="spellStart"/>
-      <w:r>
-        <w:rPr>
-          <w:b/>
-          <w:bCs/>
-          <w:color w:val="1F3A5F"/>
-          <w:sz w:val="30"/>
-          <w:szCs w:val="30"/>
-        </w:rPr>
-        <w:t>Prompts</w:t>
-      </w:r>
-      <w:proofErr w:type="spellEnd"/>
-      <w:r>
-        <w:rPr>
-          <w:b/>
-          <w:bCs/>
-          <w:color w:val="1F3A5F"/>
-          <w:sz w:val="30"/>
-          <w:szCs w:val="30"/>
-        </w:rPr>
-        <w:t xml:space="preserve"> de IA por archivo y mapa conceptual</w:t>
+        <w:t>7. Prompts de IA por archivo y mapa conceptual</w:t>
       </w:r>
       <w:bookmarkEnd w:id="17"/>
     </w:p>
@@ -7298,15 +6147,7 @@
         <w:spacing w:after="120" w:line="300" w:lineRule="auto"/>
       </w:pPr>
       <w:r>
-        <w:t xml:space="preserve">En todos los archivos HTML y JS hay en la cabecera mínimo 4 </w:t>
-      </w:r>
-      <w:proofErr w:type="spellStart"/>
-      <w:r>
-        <w:t>prompts</w:t>
-      </w:r>
-      <w:proofErr w:type="spellEnd"/>
-      <w:r>
-        <w:t xml:space="preserve"> con la IA utilizada. Las respuestas se probaron en el navegador y se contrastaron con MDN y la documentación de Bootstrap.</w:t>
+        <w:t>En todos los archivos HTML y JS hay en la cabecera mínimo 4 prompts con la IA utilizada. Las respuestas se probaron en el navegador y se contrastaron con MDN y la documentación de Bootstrap.</w:t>
       </w:r>
     </w:p>
     <w:tbl>
@@ -7332,12 +6173,6 @@
         <w:gridCol w:w="6426"/>
       </w:tblGrid>
       <w:tr>
-        <w:tblPrEx>
-          <w:tblCellMar>
-            <w:top w:w="0" w:type="dxa"/>
-            <w:bottom w:w="0" w:type="dxa"/>
-          </w:tblCellMar>
-        </w:tblPrEx>
         <w:trPr>
           <w:tblHeader/>
         </w:trPr>
@@ -7428,7 +6263,6 @@
             <w:pPr>
               <w:spacing w:after="40" w:line="260" w:lineRule="auto"/>
             </w:pPr>
-            <w:proofErr w:type="spellStart"/>
             <w:r>
               <w:rPr>
                 <w:b/>
@@ -7439,17 +6273,10 @@
               </w:rPr>
               <w:t>Prompt</w:t>
             </w:r>
-            <w:proofErr w:type="spellEnd"/>
           </w:p>
         </w:tc>
       </w:tr>
       <w:tr>
-        <w:tblPrEx>
-          <w:tblCellMar>
-            <w:top w:w="0" w:type="dxa"/>
-            <w:bottom w:w="0" w:type="dxa"/>
-          </w:tblCellMar>
-        </w:tblPrEx>
         <w:trPr>
           <w:cantSplit/>
         </w:trPr>
@@ -7539,34 +6366,12 @@
                 <w:sz w:val="17"/>
                 <w:szCs w:val="17"/>
               </w:rPr>
-              <w:t xml:space="preserve">Hazme el HTML del </w:t>
-            </w:r>
-            <w:proofErr w:type="spellStart"/>
-            <w:r>
-              <w:rPr>
-                <w:sz w:val="17"/>
-                <w:szCs w:val="17"/>
-              </w:rPr>
-              <w:t>Dashboard</w:t>
-            </w:r>
-            <w:proofErr w:type="spellEnd"/>
-            <w:r>
-              <w:rPr>
-                <w:sz w:val="17"/>
-                <w:szCs w:val="17"/>
-              </w:rPr>
-              <w:t xml:space="preserve"> con una barra de navegación de Bootstrap 5 y un contenedor donde JavaScript pinte tarjetas de intercambios.</w:t>
+              <w:t>Hazme el HTML del Dashboard con una barra de navegación de Bootstrap 5 y un contenedor donde JavaScript pinte tarjetas de intercambios.</w:t>
             </w:r>
           </w:p>
         </w:tc>
       </w:tr>
       <w:tr>
-        <w:tblPrEx>
-          <w:tblCellMar>
-            <w:top w:w="0" w:type="dxa"/>
-            <w:bottom w:w="0" w:type="dxa"/>
-          </w:tblCellMar>
-        </w:tblPrEx>
         <w:trPr>
           <w:cantSplit/>
         </w:trPr>
@@ -7655,12 +6460,6 @@
         </w:tc>
       </w:tr>
       <w:tr>
-        <w:tblPrEx>
-          <w:tblCellMar>
-            <w:top w:w="0" w:type="dxa"/>
-            <w:bottom w:w="0" w:type="dxa"/>
-          </w:tblCellMar>
-        </w:tblPrEx>
         <w:trPr>
           <w:cantSplit/>
         </w:trPr>
@@ -7743,50 +6542,12 @@
                 <w:sz w:val="17"/>
                 <w:szCs w:val="17"/>
               </w:rPr>
-              <w:t xml:space="preserve">Explícame para qué sirve </w:t>
-            </w:r>
-            <w:proofErr w:type="spellStart"/>
-            <w:r>
-              <w:rPr>
-                <w:sz w:val="17"/>
-                <w:szCs w:val="17"/>
-              </w:rPr>
-              <w:t>type</w:t>
-            </w:r>
-            <w:proofErr w:type="spellEnd"/>
-            <w:r>
-              <w:rPr>
-                <w:sz w:val="17"/>
-                <w:szCs w:val="17"/>
-              </w:rPr>
-              <w:t>=module en la etiqueta script y por qué las rutas de las páginas llevan</w:t>
-            </w:r>
-            <w:proofErr w:type="gramStart"/>
-            <w:r>
-              <w:rPr>
-                <w:sz w:val="17"/>
-                <w:szCs w:val="17"/>
-              </w:rPr>
-              <w:t xml:space="preserve"> ..</w:t>
-            </w:r>
-            <w:proofErr w:type="gramEnd"/>
-            <w:r>
-              <w:rPr>
-                <w:sz w:val="17"/>
-                <w:szCs w:val="17"/>
-              </w:rPr>
-              <w:t>/</w:t>
+              <w:t>Explícame para qué sirve type=module en la etiqueta script y por qué las rutas de las páginas llevan ../</w:t>
             </w:r>
           </w:p>
         </w:tc>
       </w:tr>
       <w:tr>
-        <w:tblPrEx>
-          <w:tblCellMar>
-            <w:top w:w="0" w:type="dxa"/>
-            <w:bottom w:w="0" w:type="dxa"/>
-          </w:tblCellMar>
-        </w:tblPrEx>
         <w:trPr>
           <w:cantSplit/>
         </w:trPr>
@@ -7875,12 +6636,6 @@
         </w:tc>
       </w:tr>
       <w:tr>
-        <w:tblPrEx>
-          <w:tblCellMar>
-            <w:top w:w="0" w:type="dxa"/>
-            <w:bottom w:w="0" w:type="dxa"/>
-          </w:tblCellMar>
-        </w:tblPrEx>
         <w:trPr>
           <w:cantSplit/>
         </w:trPr>
@@ -7976,12 +6731,6 @@
         </w:tc>
       </w:tr>
       <w:tr>
-        <w:tblPrEx>
-          <w:tblCellMar>
-            <w:top w:w="0" w:type="dxa"/>
-            <w:bottom w:w="0" w:type="dxa"/>
-          </w:tblCellMar>
-        </w:tblPrEx>
         <w:trPr>
           <w:cantSplit/>
         </w:trPr>
@@ -8064,66 +6813,12 @@
                 <w:sz w:val="17"/>
                 <w:szCs w:val="17"/>
               </w:rPr>
-              <w:t xml:space="preserve">¿Qué hace el atributo </w:t>
-            </w:r>
-            <w:proofErr w:type="spellStart"/>
-            <w:r>
-              <w:rPr>
-                <w:sz w:val="17"/>
-                <w:szCs w:val="17"/>
-              </w:rPr>
-              <w:t>novalidate</w:t>
-            </w:r>
-            <w:proofErr w:type="spellEnd"/>
-            <w:r>
-              <w:rPr>
-                <w:sz w:val="17"/>
-                <w:szCs w:val="17"/>
-              </w:rPr>
-              <w:t xml:space="preserve"> en un </w:t>
-            </w:r>
-            <w:proofErr w:type="spellStart"/>
-            <w:r>
-              <w:rPr>
-                <w:sz w:val="17"/>
-                <w:szCs w:val="17"/>
-              </w:rPr>
-              <w:t>form</w:t>
-            </w:r>
-            <w:proofErr w:type="spellEnd"/>
-            <w:r>
-              <w:rPr>
-                <w:sz w:val="17"/>
-                <w:szCs w:val="17"/>
-              </w:rPr>
-              <w:t xml:space="preserve"> y cómo se combina con la clase </w:t>
-            </w:r>
-            <w:proofErr w:type="spellStart"/>
-            <w:r>
-              <w:rPr>
-                <w:sz w:val="17"/>
-                <w:szCs w:val="17"/>
-              </w:rPr>
-              <w:t>was-validated</w:t>
-            </w:r>
-            <w:proofErr w:type="spellEnd"/>
-            <w:r>
-              <w:rPr>
-                <w:sz w:val="17"/>
-                <w:szCs w:val="17"/>
-              </w:rPr>
-              <w:t>?</w:t>
+              <w:t>¿Qué hace el atributo novalidate en un form y cómo se combina con la clase was-validated?</w:t>
             </w:r>
           </w:p>
         </w:tc>
       </w:tr>
       <w:tr>
-        <w:tblPrEx>
-          <w:tblCellMar>
-            <w:top w:w="0" w:type="dxa"/>
-            <w:bottom w:w="0" w:type="dxa"/>
-          </w:tblCellMar>
-        </w:tblPrEx>
         <w:trPr>
           <w:cantSplit/>
         </w:trPr>
@@ -8212,12 +6907,6 @@
         </w:tc>
       </w:tr>
       <w:tr>
-        <w:tblPrEx>
-          <w:tblCellMar>
-            <w:top w:w="0" w:type="dxa"/>
-            <w:bottom w:w="0" w:type="dxa"/>
-          </w:tblCellMar>
-        </w:tblPrEx>
         <w:trPr>
           <w:cantSplit/>
         </w:trPr>
@@ -8306,12 +6995,6 @@
         </w:tc>
       </w:tr>
       <w:tr>
-        <w:tblPrEx>
-          <w:tblCellMar>
-            <w:top w:w="0" w:type="dxa"/>
-            <w:bottom w:w="0" w:type="dxa"/>
-          </w:tblCellMar>
-        </w:tblPrEx>
         <w:trPr>
           <w:cantSplit/>
         </w:trPr>
@@ -8407,12 +7090,6 @@
         </w:tc>
       </w:tr>
       <w:tr>
-        <w:tblPrEx>
-          <w:tblCellMar>
-            <w:top w:w="0" w:type="dxa"/>
-            <w:bottom w:w="0" w:type="dxa"/>
-          </w:tblCellMar>
-        </w:tblPrEx>
         <w:trPr>
           <w:cantSplit/>
         </w:trPr>
@@ -8495,50 +7172,12 @@
                 <w:sz w:val="17"/>
                 <w:szCs w:val="17"/>
               </w:rPr>
-              <w:t xml:space="preserve">¿Qué diferencia hay entre </w:t>
-            </w:r>
-            <w:proofErr w:type="spellStart"/>
-            <w:r>
-              <w:rPr>
-                <w:sz w:val="17"/>
-                <w:szCs w:val="17"/>
-              </w:rPr>
-              <w:t>navbar-expand-lg</w:t>
-            </w:r>
-            <w:proofErr w:type="spellEnd"/>
-            <w:r>
-              <w:rPr>
-                <w:sz w:val="17"/>
-                <w:szCs w:val="17"/>
-              </w:rPr>
-              <w:t xml:space="preserve"> y </w:t>
-            </w:r>
-            <w:proofErr w:type="spellStart"/>
-            <w:r>
-              <w:rPr>
-                <w:sz w:val="17"/>
-                <w:szCs w:val="17"/>
-              </w:rPr>
-              <w:t>navbar-expand-md</w:t>
-            </w:r>
-            <w:proofErr w:type="spellEnd"/>
-            <w:r>
-              <w:rPr>
-                <w:sz w:val="17"/>
-                <w:szCs w:val="17"/>
-              </w:rPr>
-              <w:t>?</w:t>
+              <w:t>¿Qué diferencia hay entre navbar-expand-lg y navbar-expand-md?</w:t>
             </w:r>
           </w:p>
         </w:tc>
       </w:tr>
       <w:tr>
-        <w:tblPrEx>
-          <w:tblCellMar>
-            <w:top w:w="0" w:type="dxa"/>
-            <w:bottom w:w="0" w:type="dxa"/>
-          </w:tblCellMar>
-        </w:tblPrEx>
         <w:trPr>
           <w:cantSplit/>
         </w:trPr>
@@ -8627,12 +7266,6 @@
         </w:tc>
       </w:tr>
       <w:tr>
-        <w:tblPrEx>
-          <w:tblCellMar>
-            <w:top w:w="0" w:type="dxa"/>
-            <w:bottom w:w="0" w:type="dxa"/>
-          </w:tblCellMar>
-        </w:tblPrEx>
         <w:trPr>
           <w:cantSplit/>
         </w:trPr>
@@ -8721,12 +7354,6 @@
         </w:tc>
       </w:tr>
       <w:tr>
-        <w:tblPrEx>
-          <w:tblCellMar>
-            <w:top w:w="0" w:type="dxa"/>
-            <w:bottom w:w="0" w:type="dxa"/>
-          </w:tblCellMar>
-        </w:tblPrEx>
         <w:trPr>
           <w:cantSplit/>
         </w:trPr>
@@ -8822,12 +7449,6 @@
         </w:tc>
       </w:tr>
       <w:tr>
-        <w:tblPrEx>
-          <w:tblCellMar>
-            <w:top w:w="0" w:type="dxa"/>
-            <w:bottom w:w="0" w:type="dxa"/>
-          </w:tblCellMar>
-        </w:tblPrEx>
         <w:trPr>
           <w:cantSplit/>
         </w:trPr>
@@ -8910,66 +7531,12 @@
                 <w:sz w:val="17"/>
                 <w:szCs w:val="17"/>
               </w:rPr>
-              <w:t xml:space="preserve">Añade validación al formulario con </w:t>
-            </w:r>
-            <w:proofErr w:type="spellStart"/>
-            <w:r>
-              <w:rPr>
-                <w:sz w:val="17"/>
-                <w:szCs w:val="17"/>
-              </w:rPr>
-              <w:t>checkValidity</w:t>
-            </w:r>
-            <w:proofErr w:type="spellEnd"/>
-            <w:r>
-              <w:rPr>
-                <w:sz w:val="17"/>
-                <w:szCs w:val="17"/>
-              </w:rPr>
-              <w:t xml:space="preserve"> y las clases </w:t>
-            </w:r>
-            <w:proofErr w:type="spellStart"/>
-            <w:r>
-              <w:rPr>
-                <w:sz w:val="17"/>
-                <w:szCs w:val="17"/>
-              </w:rPr>
-              <w:t>was-validated</w:t>
-            </w:r>
-            <w:proofErr w:type="spellEnd"/>
-            <w:r>
-              <w:rPr>
-                <w:sz w:val="17"/>
-                <w:szCs w:val="17"/>
-              </w:rPr>
-              <w:t xml:space="preserve"> e </w:t>
-            </w:r>
-            <w:proofErr w:type="spellStart"/>
-            <w:r>
-              <w:rPr>
-                <w:sz w:val="17"/>
-                <w:szCs w:val="17"/>
-              </w:rPr>
-              <w:t>invalid-feedback</w:t>
-            </w:r>
-            <w:proofErr w:type="spellEnd"/>
-            <w:r>
-              <w:rPr>
-                <w:sz w:val="17"/>
-                <w:szCs w:val="17"/>
-              </w:rPr>
-              <w:t xml:space="preserve"> de Bootstrap, y que no deje repetir el correo.</w:t>
+              <w:t>Añade validación al formulario con checkValidity y las clases was-validated e invalid-feedback de Bootstrap, y que no deje repetir el correo.</w:t>
             </w:r>
           </w:p>
         </w:tc>
       </w:tr>
       <w:tr>
-        <w:tblPrEx>
-          <w:tblCellMar>
-            <w:top w:w="0" w:type="dxa"/>
-            <w:bottom w:w="0" w:type="dxa"/>
-          </w:tblCellMar>
-        </w:tblPrEx>
         <w:trPr>
           <w:cantSplit/>
         </w:trPr>
@@ -9058,12 +7625,6 @@
         </w:tc>
       </w:tr>
       <w:tr>
-        <w:tblPrEx>
-          <w:tblCellMar>
-            <w:top w:w="0" w:type="dxa"/>
-            <w:bottom w:w="0" w:type="dxa"/>
-          </w:tblCellMar>
-        </w:tblPrEx>
         <w:trPr>
           <w:cantSplit/>
         </w:trPr>
@@ -9152,12 +7713,6 @@
         </w:tc>
       </w:tr>
       <w:tr>
-        <w:tblPrEx>
-          <w:tblCellMar>
-            <w:top w:w="0" w:type="dxa"/>
-            <w:bottom w:w="0" w:type="dxa"/>
-          </w:tblCellMar>
-        </w:tblPrEx>
         <w:trPr>
           <w:cantSplit/>
         </w:trPr>
@@ -9247,18 +7802,12 @@
                 <w:sz w:val="17"/>
                 <w:szCs w:val="17"/>
               </w:rPr>
-              <w:t>Hazme la pantalla de Intercambios con un formulario para publicar una oferta o una petición y un listado de tarjetas con Bootstrap 5.</w:t>
+              <w:t>Hazme la pantalla de Intercambios con un formulario para publicar una oferta o una petición y una tabla con todos los intercambios, usando Bootstrap 5.</w:t>
             </w:r>
           </w:p>
         </w:tc>
       </w:tr>
       <w:tr>
-        <w:tblPrEx>
-          <w:tblCellMar>
-            <w:top w:w="0" w:type="dxa"/>
-            <w:bottom w:w="0" w:type="dxa"/>
-          </w:tblCellMar>
-        </w:tblPrEx>
         <w:trPr>
           <w:cantSplit/>
         </w:trPr>
@@ -9341,18 +7890,12 @@
                 <w:sz w:val="17"/>
                 <w:szCs w:val="17"/>
               </w:rPr>
-              <w:t>Quiero filtrar las tarjetas por tipo, por idioma y con un buscador de texto que se actualice mientras escribo.</w:t>
+              <w:t>Quiero filtrar los intercambios por tipo, por idioma y con un buscador de texto que se actualice mientras escribo.</w:t>
             </w:r>
           </w:p>
         </w:tc>
       </w:tr>
       <w:tr>
-        <w:tblPrEx>
-          <w:tblCellMar>
-            <w:top w:w="0" w:type="dxa"/>
-            <w:bottom w:w="0" w:type="dxa"/>
-          </w:tblCellMar>
-        </w:tblPrEx>
         <w:trPr>
           <w:cantSplit/>
         </w:trPr>
@@ -9435,34 +7978,12 @@
                 <w:sz w:val="17"/>
                 <w:szCs w:val="17"/>
               </w:rPr>
-              <w:t xml:space="preserve">Explícame cómo validar el formulario con </w:t>
-            </w:r>
-            <w:proofErr w:type="spellStart"/>
-            <w:r>
-              <w:rPr>
-                <w:sz w:val="17"/>
-                <w:szCs w:val="17"/>
-              </w:rPr>
-              <w:t>checkValidity</w:t>
-            </w:r>
-            <w:proofErr w:type="spellEnd"/>
-            <w:r>
-              <w:rPr>
-                <w:sz w:val="17"/>
-                <w:szCs w:val="17"/>
-              </w:rPr>
-              <w:t xml:space="preserve"> y cómo rellenar un desplegable de autores a partir de la lista de usuarios de datos.js.</w:t>
+              <w:t>Explícame cómo validar el formulario con checkValidity y cómo rellenar un desplegable de autores a partir de la lista de usuarios de datos.js.</w:t>
             </w:r>
           </w:p>
         </w:tc>
       </w:tr>
       <w:tr>
-        <w:tblPrEx>
-          <w:tblCellMar>
-            <w:top w:w="0" w:type="dxa"/>
-            <w:bottom w:w="0" w:type="dxa"/>
-          </w:tblCellMar>
-        </w:tblPrEx>
         <w:trPr>
           <w:cantSplit/>
         </w:trPr>
@@ -9551,12 +8072,6 @@
         </w:tc>
       </w:tr>
       <w:tr>
-        <w:tblPrEx>
-          <w:tblCellMar>
-            <w:top w:w="0" w:type="dxa"/>
-            <w:bottom w:w="0" w:type="dxa"/>
-          </w:tblCellMar>
-        </w:tblPrEx>
         <w:trPr>
           <w:cantSplit/>
         </w:trPr>
@@ -9646,34 +8161,12 @@
                 <w:sz w:val="17"/>
                 <w:szCs w:val="17"/>
               </w:rPr>
-              <w:t xml:space="preserve">Escribe el JS que recorra el array intercambios importado de datos.js y cree una tarjeta de Bootstrap por cada elemento con </w:t>
-            </w:r>
-            <w:proofErr w:type="spellStart"/>
-            <w:r>
-              <w:rPr>
-                <w:sz w:val="17"/>
-                <w:szCs w:val="17"/>
-              </w:rPr>
-              <w:t>createElement</w:t>
-            </w:r>
-            <w:proofErr w:type="spellEnd"/>
-            <w:r>
-              <w:rPr>
-                <w:sz w:val="17"/>
-                <w:szCs w:val="17"/>
-              </w:rPr>
-              <w:t>.</w:t>
+              <w:t>Escribe el JS que recorra el array intercambios importado de datos.js y cree una tarjeta de Bootstrap por cada elemento con createElement.</w:t>
             </w:r>
           </w:p>
         </w:tc>
       </w:tr>
       <w:tr>
-        <w:tblPrEx>
-          <w:tblCellMar>
-            <w:top w:w="0" w:type="dxa"/>
-            <w:bottom w:w="0" w:type="dxa"/>
-          </w:tblCellMar>
-        </w:tblPrEx>
         <w:trPr>
           <w:cantSplit/>
         </w:trPr>
@@ -9762,12 +8255,6 @@
         </w:tc>
       </w:tr>
       <w:tr>
-        <w:tblPrEx>
-          <w:tblCellMar>
-            <w:top w:w="0" w:type="dxa"/>
-            <w:bottom w:w="0" w:type="dxa"/>
-          </w:tblCellMar>
-        </w:tblPrEx>
         <w:trPr>
           <w:cantSplit/>
         </w:trPr>
@@ -9850,34 +8337,12 @@
                 <w:sz w:val="17"/>
                 <w:szCs w:val="17"/>
               </w:rPr>
-              <w:t xml:space="preserve">Haz que el filtro de tipo repinte las tarjetas con </w:t>
-            </w:r>
-            <w:proofErr w:type="spellStart"/>
-            <w:r>
-              <w:rPr>
-                <w:sz w:val="17"/>
-                <w:szCs w:val="17"/>
-              </w:rPr>
-              <w:t>Array.filter</w:t>
-            </w:r>
-            <w:proofErr w:type="spellEnd"/>
-            <w:r>
-              <w:rPr>
-                <w:sz w:val="17"/>
-                <w:szCs w:val="17"/>
-              </w:rPr>
-              <w:t xml:space="preserve"> cuando cambie el desplegable.</w:t>
+              <w:t>Haz que el filtro de tipo repinte las tarjetas con Array.filter cuando cambie el desplegable.</w:t>
             </w:r>
           </w:p>
         </w:tc>
       </w:tr>
       <w:tr>
-        <w:tblPrEx>
-          <w:tblCellMar>
-            <w:top w:w="0" w:type="dxa"/>
-            <w:bottom w:w="0" w:type="dxa"/>
-          </w:tblCellMar>
-        </w:tblPrEx>
         <w:trPr>
           <w:cantSplit/>
         </w:trPr>
@@ -9960,50 +8425,12 @@
                 <w:sz w:val="17"/>
                 <w:szCs w:val="17"/>
               </w:rPr>
-              <w:t xml:space="preserve">¿Por qué debo usar </w:t>
-            </w:r>
-            <w:proofErr w:type="spellStart"/>
-            <w:r>
-              <w:rPr>
-                <w:sz w:val="17"/>
-                <w:szCs w:val="17"/>
-              </w:rPr>
-              <w:t>escaparHtml</w:t>
-            </w:r>
-            <w:proofErr w:type="spellEnd"/>
-            <w:r>
-              <w:rPr>
-                <w:sz w:val="17"/>
-                <w:szCs w:val="17"/>
-              </w:rPr>
-              <w:t xml:space="preserve"> antes de meter texto en </w:t>
-            </w:r>
-            <w:proofErr w:type="spellStart"/>
-            <w:r>
-              <w:rPr>
-                <w:sz w:val="17"/>
-                <w:szCs w:val="17"/>
-              </w:rPr>
-              <w:t>innerHTML</w:t>
-            </w:r>
-            <w:proofErr w:type="spellEnd"/>
-            <w:r>
-              <w:rPr>
-                <w:sz w:val="17"/>
-                <w:szCs w:val="17"/>
-              </w:rPr>
-              <w:t>?</w:t>
+              <w:t>¿Por qué debo usar escaparHtml antes de meter texto en innerHTML?</w:t>
             </w:r>
           </w:p>
         </w:tc>
       </w:tr>
       <w:tr>
-        <w:tblPrEx>
-          <w:tblCellMar>
-            <w:top w:w="0" w:type="dxa"/>
-            <w:bottom w:w="0" w:type="dxa"/>
-          </w:tblCellMar>
-        </w:tblPrEx>
         <w:trPr>
           <w:cantSplit/>
         </w:trPr>
@@ -10093,34 +8520,12 @@
                 <w:sz w:val="17"/>
                 <w:szCs w:val="17"/>
               </w:rPr>
-              <w:t xml:space="preserve">¿Cómo valido un formulario con Bootstrap 5 y JS puro usando </w:t>
-            </w:r>
-            <w:proofErr w:type="spellStart"/>
-            <w:r>
-              <w:rPr>
-                <w:sz w:val="17"/>
-                <w:szCs w:val="17"/>
-              </w:rPr>
-              <w:t>checkValidity</w:t>
-            </w:r>
-            <w:proofErr w:type="spellEnd"/>
-            <w:r>
-              <w:rPr>
-                <w:sz w:val="17"/>
-                <w:szCs w:val="17"/>
-              </w:rPr>
-              <w:t>?</w:t>
+              <w:t>¿Cómo valido un formulario con Bootstrap 5 y JS puro usando checkValidity?</w:t>
             </w:r>
           </w:p>
         </w:tc>
       </w:tr>
       <w:tr>
-        <w:tblPrEx>
-          <w:tblCellMar>
-            <w:top w:w="0" w:type="dxa"/>
-            <w:bottom w:w="0" w:type="dxa"/>
-          </w:tblCellMar>
-        </w:tblPrEx>
         <w:trPr>
           <w:cantSplit/>
         </w:trPr>
@@ -10203,34 +8608,12 @@
                 <w:sz w:val="17"/>
                 <w:szCs w:val="17"/>
               </w:rPr>
-              <w:t xml:space="preserve">Busca un usuario en un array por correo y contraseña con </w:t>
-            </w:r>
-            <w:proofErr w:type="spellStart"/>
-            <w:r>
-              <w:rPr>
-                <w:sz w:val="17"/>
-                <w:szCs w:val="17"/>
-              </w:rPr>
-              <w:t>find</w:t>
-            </w:r>
-            <w:proofErr w:type="spellEnd"/>
-            <w:r>
-              <w:rPr>
-                <w:sz w:val="17"/>
-                <w:szCs w:val="17"/>
-              </w:rPr>
-              <w:t>.</w:t>
+              <w:t>Busca un usuario en un array por correo y contraseña con find.</w:t>
             </w:r>
           </w:p>
         </w:tc>
       </w:tr>
       <w:tr>
-        <w:tblPrEx>
-          <w:tblCellMar>
-            <w:top w:w="0" w:type="dxa"/>
-            <w:bottom w:w="0" w:type="dxa"/>
-          </w:tblCellMar>
-        </w:tblPrEx>
         <w:trPr>
           <w:cantSplit/>
         </w:trPr>
@@ -10313,52 +8696,12 @@
                 <w:sz w:val="17"/>
                 <w:szCs w:val="17"/>
               </w:rPr>
-              <w:t xml:space="preserve">Explica </w:t>
-            </w:r>
-            <w:proofErr w:type="spellStart"/>
-            <w:proofErr w:type="gramStart"/>
-            <w:r>
-              <w:rPr>
-                <w:sz w:val="17"/>
-                <w:szCs w:val="17"/>
-              </w:rPr>
-              <w:t>event.preventDefault</w:t>
-            </w:r>
-            <w:proofErr w:type="spellEnd"/>
-            <w:proofErr w:type="gramEnd"/>
-            <w:r>
-              <w:rPr>
-                <w:sz w:val="17"/>
-                <w:szCs w:val="17"/>
-              </w:rPr>
-              <w:t xml:space="preserve">() en un evento </w:t>
-            </w:r>
-            <w:proofErr w:type="spellStart"/>
-            <w:r>
-              <w:rPr>
-                <w:sz w:val="17"/>
-                <w:szCs w:val="17"/>
-              </w:rPr>
-              <w:t>submit</w:t>
-            </w:r>
-            <w:proofErr w:type="spellEnd"/>
-            <w:r>
-              <w:rPr>
-                <w:sz w:val="17"/>
-                <w:szCs w:val="17"/>
-              </w:rPr>
-              <w:t>.</w:t>
+              <w:t>Explica event.preventDefault() en un evento submit.</w:t>
             </w:r>
           </w:p>
         </w:tc>
       </w:tr>
       <w:tr>
-        <w:tblPrEx>
-          <w:tblCellMar>
-            <w:top w:w="0" w:type="dxa"/>
-            <w:bottom w:w="0" w:type="dxa"/>
-          </w:tblCellMar>
-        </w:tblPrEx>
         <w:trPr>
           <w:cantSplit/>
         </w:trPr>
@@ -10447,12 +8790,6 @@
         </w:tc>
       </w:tr>
       <w:tr>
-        <w:tblPrEx>
-          <w:tblCellMar>
-            <w:top w:w="0" w:type="dxa"/>
-            <w:bottom w:w="0" w:type="dxa"/>
-          </w:tblCellMar>
-        </w:tblPrEx>
         <w:trPr>
           <w:cantSplit/>
         </w:trPr>
@@ -10542,34 +8879,12 @@
                 <w:sz w:val="17"/>
                 <w:szCs w:val="17"/>
               </w:rPr>
-              <w:t xml:space="preserve">¿Cómo organizo datos de ejemplo de usuarios e intercambios como </w:t>
-            </w:r>
-            <w:proofErr w:type="spellStart"/>
-            <w:r>
-              <w:rPr>
-                <w:sz w:val="17"/>
-                <w:szCs w:val="17"/>
-              </w:rPr>
-              <w:t>arrays</w:t>
-            </w:r>
-            <w:proofErr w:type="spellEnd"/>
-            <w:r>
-              <w:rPr>
-                <w:sz w:val="17"/>
-                <w:szCs w:val="17"/>
-              </w:rPr>
-              <w:t xml:space="preserve"> de objetos en un único archivo exportado como módulo ES?</w:t>
+              <w:t>¿Cómo organizo datos de ejemplo de usuarios e intercambios como arrays de objetos en un único archivo exportado como módulo ES?</w:t>
             </w:r>
           </w:p>
         </w:tc>
       </w:tr>
       <w:tr>
-        <w:tblPrEx>
-          <w:tblCellMar>
-            <w:top w:w="0" w:type="dxa"/>
-            <w:bottom w:w="0" w:type="dxa"/>
-          </w:tblCellMar>
-        </w:tblPrEx>
         <w:trPr>
           <w:cantSplit/>
         </w:trPr>
@@ -10652,82 +8967,12 @@
                 <w:sz w:val="17"/>
                 <w:szCs w:val="17"/>
               </w:rPr>
-              <w:t xml:space="preserve">¿Por qué no puedo reasignar una lista importada con </w:t>
-            </w:r>
-            <w:proofErr w:type="spellStart"/>
-            <w:r>
-              <w:rPr>
-                <w:sz w:val="17"/>
-                <w:szCs w:val="17"/>
-              </w:rPr>
-              <w:t>export</w:t>
-            </w:r>
-            <w:proofErr w:type="spellEnd"/>
-            <w:r>
-              <w:rPr>
-                <w:sz w:val="17"/>
-                <w:szCs w:val="17"/>
-              </w:rPr>
-              <w:t xml:space="preserve"> </w:t>
-            </w:r>
-            <w:proofErr w:type="spellStart"/>
-            <w:r>
-              <w:rPr>
-                <w:sz w:val="17"/>
-                <w:szCs w:val="17"/>
-              </w:rPr>
-              <w:t>const</w:t>
-            </w:r>
-            <w:proofErr w:type="spellEnd"/>
-            <w:r>
-              <w:rPr>
-                <w:sz w:val="17"/>
-                <w:szCs w:val="17"/>
-              </w:rPr>
-              <w:t xml:space="preserve">, pero sí usar </w:t>
-            </w:r>
-            <w:proofErr w:type="spellStart"/>
-            <w:r>
-              <w:rPr>
-                <w:sz w:val="17"/>
-                <w:szCs w:val="17"/>
-              </w:rPr>
-              <w:t>push</w:t>
-            </w:r>
-            <w:proofErr w:type="spellEnd"/>
-            <w:r>
-              <w:rPr>
-                <w:sz w:val="17"/>
-                <w:szCs w:val="17"/>
-              </w:rPr>
-              <w:t xml:space="preserve"> y </w:t>
-            </w:r>
-            <w:proofErr w:type="spellStart"/>
-            <w:r>
-              <w:rPr>
-                <w:sz w:val="17"/>
-                <w:szCs w:val="17"/>
-              </w:rPr>
-              <w:t>splice</w:t>
-            </w:r>
-            <w:proofErr w:type="spellEnd"/>
-            <w:r>
-              <w:rPr>
-                <w:sz w:val="17"/>
-                <w:szCs w:val="17"/>
-              </w:rPr>
-              <w:t>?</w:t>
+              <w:t>¿Por qué no puedo reasignar una lista importada con export const, pero sí usar push y splice?</w:t>
             </w:r>
           </w:p>
         </w:tc>
       </w:tr>
       <w:tr>
-        <w:tblPrEx>
-          <w:tblCellMar>
-            <w:top w:w="0" w:type="dxa"/>
-            <w:bottom w:w="0" w:type="dxa"/>
-          </w:tblCellMar>
-        </w:tblPrEx>
         <w:trPr>
           <w:cantSplit/>
         </w:trPr>
@@ -10816,12 +9061,6 @@
         </w:tc>
       </w:tr>
       <w:tr>
-        <w:tblPrEx>
-          <w:tblCellMar>
-            <w:top w:w="0" w:type="dxa"/>
-            <w:bottom w:w="0" w:type="dxa"/>
-          </w:tblCellMar>
-        </w:tblPrEx>
         <w:trPr>
           <w:cantSplit/>
         </w:trPr>
@@ -10910,12 +9149,6 @@
         </w:tc>
       </w:tr>
       <w:tr>
-        <w:tblPrEx>
-          <w:tblCellMar>
-            <w:top w:w="0" w:type="dxa"/>
-            <w:bottom w:w="0" w:type="dxa"/>
-          </w:tblCellMar>
-        </w:tblPrEx>
         <w:trPr>
           <w:cantSplit/>
         </w:trPr>
@@ -11011,12 +9244,6 @@
         </w:tc>
       </w:tr>
       <w:tr>
-        <w:tblPrEx>
-          <w:tblCellMar>
-            <w:top w:w="0" w:type="dxa"/>
-            <w:bottom w:w="0" w:type="dxa"/>
-          </w:tblCellMar>
-        </w:tblPrEx>
         <w:trPr>
           <w:cantSplit/>
         </w:trPr>
@@ -11099,34 +9326,12 @@
                 <w:sz w:val="17"/>
                 <w:szCs w:val="17"/>
               </w:rPr>
-              <w:t>Función que muestre un aviso de Bootstrap (</w:t>
-            </w:r>
-            <w:proofErr w:type="spellStart"/>
-            <w:r>
-              <w:rPr>
-                <w:sz w:val="17"/>
-                <w:szCs w:val="17"/>
-              </w:rPr>
-              <w:t>alert</w:t>
-            </w:r>
-            <w:proofErr w:type="spellEnd"/>
-            <w:r>
-              <w:rPr>
-                <w:sz w:val="17"/>
-                <w:szCs w:val="17"/>
-              </w:rPr>
-              <w:t>) con botón de cerrar dentro de un contenedor.</w:t>
+              <w:t>Función que muestre un aviso de Bootstrap (alert) con botón de cerrar dentro de un contenedor.</w:t>
             </w:r>
           </w:p>
         </w:tc>
       </w:tr>
       <w:tr>
-        <w:tblPrEx>
-          <w:tblCellMar>
-            <w:top w:w="0" w:type="dxa"/>
-            <w:bottom w:w="0" w:type="dxa"/>
-          </w:tblCellMar>
-        </w:tblPrEx>
         <w:trPr>
           <w:cantSplit/>
         </w:trPr>
@@ -11215,12 +9420,6 @@
         </w:tc>
       </w:tr>
       <w:tr>
-        <w:tblPrEx>
-          <w:tblCellMar>
-            <w:top w:w="0" w:type="dxa"/>
-            <w:bottom w:w="0" w:type="dxa"/>
-          </w:tblCellMar>
-        </w:tblPrEx>
         <w:trPr>
           <w:cantSplit/>
         </w:trPr>
@@ -11309,12 +9508,6 @@
         </w:tc>
       </w:tr>
       <w:tr>
-        <w:tblPrEx>
-          <w:tblCellMar>
-            <w:top w:w="0" w:type="dxa"/>
-            <w:bottom w:w="0" w:type="dxa"/>
-          </w:tblCellMar>
-        </w:tblPrEx>
         <w:trPr>
           <w:cantSplit/>
         </w:trPr>
@@ -11404,34 +9597,12 @@
                 <w:sz w:val="17"/>
                 <w:szCs w:val="17"/>
               </w:rPr>
-              <w:t xml:space="preserve">Escribe el JS de la pantalla de Usuarios: pintar una tabla desde el array usuarios de datos.js y dar de alta usuarios nuevos con </w:t>
-            </w:r>
-            <w:proofErr w:type="spellStart"/>
-            <w:r>
-              <w:rPr>
-                <w:sz w:val="17"/>
-                <w:szCs w:val="17"/>
-              </w:rPr>
-              <w:t>push</w:t>
-            </w:r>
-            <w:proofErr w:type="spellEnd"/>
-            <w:r>
-              <w:rPr>
-                <w:sz w:val="17"/>
-                <w:szCs w:val="17"/>
-              </w:rPr>
-              <w:t>.</w:t>
+              <w:t>Escribe el JS de la pantalla de Usuarios: pintar una tabla desde el array usuarios de datos.js y dar de alta usuarios nuevos con push.</w:t>
             </w:r>
           </w:p>
         </w:tc>
       </w:tr>
       <w:tr>
-        <w:tblPrEx>
-          <w:tblCellMar>
-            <w:top w:w="0" w:type="dxa"/>
-            <w:bottom w:w="0" w:type="dxa"/>
-          </w:tblCellMar>
-        </w:tblPrEx>
         <w:trPr>
           <w:cantSplit/>
         </w:trPr>
@@ -11514,50 +9685,12 @@
                 <w:sz w:val="17"/>
                 <w:szCs w:val="17"/>
               </w:rPr>
-              <w:t xml:space="preserve">Valida el formulario con </w:t>
-            </w:r>
-            <w:proofErr w:type="spellStart"/>
-            <w:r>
-              <w:rPr>
-                <w:sz w:val="17"/>
-                <w:szCs w:val="17"/>
-              </w:rPr>
-              <w:t>checkValidity</w:t>
-            </w:r>
-            <w:proofErr w:type="spellEnd"/>
-            <w:r>
-              <w:rPr>
-                <w:sz w:val="17"/>
-                <w:szCs w:val="17"/>
-              </w:rPr>
-              <w:t xml:space="preserve"> y con </w:t>
-            </w:r>
-            <w:proofErr w:type="spellStart"/>
-            <w:r>
-              <w:rPr>
-                <w:sz w:val="17"/>
-                <w:szCs w:val="17"/>
-              </w:rPr>
-              <w:t>setCustomValidity</w:t>
-            </w:r>
-            <w:proofErr w:type="spellEnd"/>
-            <w:r>
-              <w:rPr>
-                <w:sz w:val="17"/>
-                <w:szCs w:val="17"/>
-              </w:rPr>
-              <w:t xml:space="preserve"> para el correo repetido y para que el idioma nativo y el que aprende sean distintos.</w:t>
+              <w:t>Valida el formulario con checkValidity y con setCustomValidity para el correo repetido y para que el idioma nativo y el que aprende sean distintos.</w:t>
             </w:r>
           </w:p>
         </w:tc>
       </w:tr>
       <w:tr>
-        <w:tblPrEx>
-          <w:tblCellMar>
-            <w:top w:w="0" w:type="dxa"/>
-            <w:bottom w:w="0" w:type="dxa"/>
-          </w:tblCellMar>
-        </w:tblPrEx>
         <w:trPr>
           <w:cantSplit/>
         </w:trPr>
@@ -11640,34 +9773,12 @@
                 <w:sz w:val="17"/>
                 <w:szCs w:val="17"/>
               </w:rPr>
-              <w:t xml:space="preserve">Explícame cómo abrir un modal de Bootstrap desde JavaScript y borrar con </w:t>
-            </w:r>
-            <w:proofErr w:type="spellStart"/>
-            <w:r>
-              <w:rPr>
-                <w:sz w:val="17"/>
-                <w:szCs w:val="17"/>
-              </w:rPr>
-              <w:t>splice</w:t>
-            </w:r>
-            <w:proofErr w:type="spellEnd"/>
-            <w:r>
-              <w:rPr>
-                <w:sz w:val="17"/>
-                <w:szCs w:val="17"/>
-              </w:rPr>
-              <w:t xml:space="preserve"> el usuario elegido al confirmar.</w:t>
+              <w:t>Explícame cómo abrir un modal de Bootstrap desde JavaScript y borrar con splice el usuario elegido al confirmar.</w:t>
             </w:r>
           </w:p>
         </w:tc>
       </w:tr>
       <w:tr>
-        <w:tblPrEx>
-          <w:tblCellMar>
-            <w:top w:w="0" w:type="dxa"/>
-            <w:bottom w:w="0" w:type="dxa"/>
-          </w:tblCellMar>
-        </w:tblPrEx>
         <w:trPr>
           <w:cantSplit/>
         </w:trPr>
@@ -11750,34 +9861,12 @@
                 <w:sz w:val="17"/>
                 <w:szCs w:val="17"/>
               </w:rPr>
-              <w:t xml:space="preserve">Usa </w:t>
-            </w:r>
-            <w:proofErr w:type="spellStart"/>
-            <w:r>
-              <w:rPr>
-                <w:sz w:val="17"/>
-                <w:szCs w:val="17"/>
-              </w:rPr>
-              <w:t>escaparHtml</w:t>
-            </w:r>
-            <w:proofErr w:type="spellEnd"/>
-            <w:r>
-              <w:rPr>
-                <w:sz w:val="17"/>
-                <w:szCs w:val="17"/>
-              </w:rPr>
-              <w:t xml:space="preserve"> al pintar los datos y resalta la fila del usuario nuevo con una clase de animación.</w:t>
+              <w:t>Usa escaparHtml al pintar los datos y resalta la fila del usuario nuevo con una clase de animación.</w:t>
             </w:r>
           </w:p>
         </w:tc>
       </w:tr>
       <w:tr>
-        <w:tblPrEx>
-          <w:tblCellMar>
-            <w:top w:w="0" w:type="dxa"/>
-            <w:bottom w:w="0" w:type="dxa"/>
-          </w:tblCellMar>
-        </w:tblPrEx>
         <w:trPr>
           <w:cantSplit/>
         </w:trPr>
@@ -11867,34 +9956,12 @@
                 <w:sz w:val="17"/>
                 <w:szCs w:val="17"/>
               </w:rPr>
-              <w:t xml:space="preserve">Escribe el JS de Intercambios: pintar tarjetas desde el array intercambios de datos.js y publicar uno nuevo con </w:t>
-            </w:r>
-            <w:proofErr w:type="spellStart"/>
-            <w:r>
-              <w:rPr>
-                <w:sz w:val="17"/>
-                <w:szCs w:val="17"/>
-              </w:rPr>
-              <w:t>push</w:t>
-            </w:r>
-            <w:proofErr w:type="spellEnd"/>
-            <w:r>
-              <w:rPr>
-                <w:sz w:val="17"/>
-                <w:szCs w:val="17"/>
-              </w:rPr>
-              <w:t>.</w:t>
+              <w:t>Escribe el JS de Intercambios: pintar una tabla desde el array intercambios de datos.js y publicar uno nuevo con push.</w:t>
             </w:r>
           </w:p>
         </w:tc>
       </w:tr>
       <w:tr>
-        <w:tblPrEx>
-          <w:tblCellMar>
-            <w:top w:w="0" w:type="dxa"/>
-            <w:bottom w:w="0" w:type="dxa"/>
-          </w:tblCellMar>
-        </w:tblPrEx>
         <w:trPr>
           <w:cantSplit/>
         </w:trPr>
@@ -11977,34 +10044,12 @@
                 <w:sz w:val="17"/>
                 <w:szCs w:val="17"/>
               </w:rPr>
-              <w:t xml:space="preserve">Haz un filtro por tipo, otro por idioma y un buscador de texto que se combinen entre sí con </w:t>
-            </w:r>
-            <w:proofErr w:type="spellStart"/>
-            <w:r>
-              <w:rPr>
-                <w:sz w:val="17"/>
-                <w:szCs w:val="17"/>
-              </w:rPr>
-              <w:t>Array.filter</w:t>
-            </w:r>
-            <w:proofErr w:type="spellEnd"/>
-            <w:r>
-              <w:rPr>
-                <w:sz w:val="17"/>
-                <w:szCs w:val="17"/>
-              </w:rPr>
-              <w:t>.</w:t>
+              <w:t>Haz un filtro por tipo, otro por idioma y un buscador de texto que se combinen entre sí con Array.filter.</w:t>
             </w:r>
           </w:p>
         </w:tc>
       </w:tr>
       <w:tr>
-        <w:tblPrEx>
-          <w:tblCellMar>
-            <w:top w:w="0" w:type="dxa"/>
-            <w:bottom w:w="0" w:type="dxa"/>
-          </w:tblCellMar>
-        </w:tblPrEx>
         <w:trPr>
           <w:cantSplit/>
         </w:trPr>
@@ -12087,18 +10132,12 @@
                 <w:sz w:val="17"/>
                 <w:szCs w:val="17"/>
               </w:rPr>
-              <w:t>Rellena el desplegable de autores recorriendo el array usuarios y muestra el nombre de quien publica en cada tarjeta.</w:t>
+              <w:t>Rellena el desplegable de autores recorriendo el array usuarios y muestra el nombre de quien publica en cada fila de la tabla.</w:t>
             </w:r>
           </w:p>
         </w:tc>
       </w:tr>
       <w:tr>
-        <w:tblPrEx>
-          <w:tblCellMar>
-            <w:top w:w="0" w:type="dxa"/>
-            <w:bottom w:w="0" w:type="dxa"/>
-          </w:tblCellMar>
-        </w:tblPrEx>
         <w:trPr>
           <w:cantSplit/>
         </w:trPr>
@@ -12181,23 +10220,366 @@
                 <w:sz w:val="17"/>
                 <w:szCs w:val="17"/>
               </w:rPr>
-              <w:t xml:space="preserve">Pide confirmación con un modal de Bootstrap antes de borrar con </w:t>
-            </w:r>
-            <w:proofErr w:type="spellStart"/>
+              <w:t>Pide confirmación con un modal de Bootstrap antes de borrar con splice y avisa si no hay resultados.</w:t>
+            </w:r>
+          </w:p>
+        </w:tc>
+      </w:tr>
+      <w:tr>
+        <w:trPr>
+          <w:cantSplit/>
+        </w:trPr>
+        <w:tc>
+          <w:tcPr>
+            <w:tcW w:w="1700" w:type="dxa"/>
+            <w:tcBorders>
+              <w:top w:val="single" w:sz="4" w:space="0" w:color="C9D1DC"/>
+              <w:left w:val="single" w:sz="4" w:space="0" w:color="C9D1DC"/>
+              <w:bottom w:val="single" w:sz="4" w:space="0" w:color="C9D1DC"/>
+              <w:right w:val="single" w:sz="4" w:space="0" w:color="C9D1DC"/>
+            </w:tcBorders>
+            <w:shd w:val="clear" w:color="auto" w:fill="FFFFFF"/>
+            <w:tcMar>
+              <w:top w:w="60" w:type="dxa"/>
+              <w:left w:w="100" w:type="dxa"/>
+              <w:bottom w:w="60" w:type="dxa"/>
+              <w:right w:w="100" w:type="dxa"/>
+            </w:tcMar>
+          </w:tcPr>
+          <w:p>
+            <w:pPr>
+              <w:spacing w:after="40" w:line="260" w:lineRule="auto"/>
+            </w:pPr>
             <w:r>
               <w:rPr>
                 <w:sz w:val="17"/>
                 <w:szCs w:val="17"/>
               </w:rPr>
-              <w:t>splice</w:t>
-            </w:r>
-            <w:proofErr w:type="spellEnd"/>
+              <w:t>nav.js</w:t>
+            </w:r>
+          </w:p>
+        </w:tc>
+        <w:tc>
+          <w:tcPr>
+            <w:tcW w:w="900" w:type="dxa"/>
+            <w:tcBorders>
+              <w:top w:val="single" w:sz="4" w:space="0" w:color="C9D1DC"/>
+              <w:left w:val="single" w:sz="4" w:space="0" w:color="C9D1DC"/>
+              <w:bottom w:val="single" w:sz="4" w:space="0" w:color="C9D1DC"/>
+              <w:right w:val="single" w:sz="4" w:space="0" w:color="C9D1DC"/>
+            </w:tcBorders>
+            <w:shd w:val="clear" w:color="auto" w:fill="FFFFFF"/>
+            <w:tcMar>
+              <w:top w:w="60" w:type="dxa"/>
+              <w:left w:w="100" w:type="dxa"/>
+              <w:bottom w:w="60" w:type="dxa"/>
+              <w:right w:w="100" w:type="dxa"/>
+            </w:tcMar>
+          </w:tcPr>
+          <w:p>
+            <w:pPr>
+              <w:spacing w:after="40" w:line="260" w:lineRule="auto"/>
+            </w:pPr>
             <w:r>
               <w:rPr>
                 <w:sz w:val="17"/>
                 <w:szCs w:val="17"/>
               </w:rPr>
-              <w:t xml:space="preserve"> y avisa si no hay resultados.</w:t>
+              <w:t>Claude</w:t>
+            </w:r>
+          </w:p>
+        </w:tc>
+        <w:tc>
+          <w:tcPr>
+            <w:tcW w:w="6426" w:type="dxa"/>
+            <w:tcBorders>
+              <w:top w:val="single" w:sz="4" w:space="0" w:color="C9D1DC"/>
+              <w:left w:val="single" w:sz="4" w:space="0" w:color="C9D1DC"/>
+              <w:bottom w:val="single" w:sz="4" w:space="0" w:color="C9D1DC"/>
+              <w:right w:val="single" w:sz="4" w:space="0" w:color="C9D1DC"/>
+            </w:tcBorders>
+            <w:shd w:val="clear" w:color="auto" w:fill="FFFFFF"/>
+            <w:tcMar>
+              <w:top w:w="60" w:type="dxa"/>
+              <w:left w:w="100" w:type="dxa"/>
+              <w:bottom w:w="60" w:type="dxa"/>
+              <w:right w:w="100" w:type="dxa"/>
+            </w:tcMar>
+          </w:tcPr>
+          <w:p>
+            <w:pPr>
+              <w:spacing w:after="40" w:line="260" w:lineRule="auto"/>
+            </w:pPr>
+            <w:r>
+              <w:rPr>
+                <w:sz w:val="17"/>
+                <w:szCs w:val="17"/>
+              </w:rPr>
+              <w:t>¿Cómo guardo el correo de la persona que ha hecho login para mostrarlo en la barra de navegación de todas las páginas?</w:t>
+            </w:r>
+          </w:p>
+        </w:tc>
+      </w:tr>
+      <w:tr>
+        <w:trPr>
+          <w:cantSplit/>
+        </w:trPr>
+        <w:tc>
+          <w:tcPr>
+            <w:tcW w:w="1700" w:type="dxa"/>
+            <w:tcBorders>
+              <w:top w:val="single" w:sz="4" w:space="0" w:color="C9D1DC"/>
+              <w:left w:val="single" w:sz="4" w:space="0" w:color="C9D1DC"/>
+              <w:bottom w:val="single" w:sz="4" w:space="0" w:color="C9D1DC"/>
+              <w:right w:val="single" w:sz="4" w:space="0" w:color="C9D1DC"/>
+            </w:tcBorders>
+            <w:shd w:val="clear" w:color="auto" w:fill="F3F5F8"/>
+            <w:tcMar>
+              <w:top w:w="60" w:type="dxa"/>
+              <w:left w:w="100" w:type="dxa"/>
+              <w:bottom w:w="60" w:type="dxa"/>
+              <w:right w:w="100" w:type="dxa"/>
+            </w:tcMar>
+          </w:tcPr>
+          <w:p>
+            <w:pPr>
+              <w:spacing w:after="40" w:line="260" w:lineRule="auto"/>
+            </w:pPr>
+          </w:p>
+        </w:tc>
+        <w:tc>
+          <w:tcPr>
+            <w:tcW w:w="900" w:type="dxa"/>
+            <w:tcBorders>
+              <w:top w:val="single" w:sz="4" w:space="0" w:color="C9D1DC"/>
+              <w:left w:val="single" w:sz="4" w:space="0" w:color="C9D1DC"/>
+              <w:bottom w:val="single" w:sz="4" w:space="0" w:color="C9D1DC"/>
+              <w:right w:val="single" w:sz="4" w:space="0" w:color="C9D1DC"/>
+            </w:tcBorders>
+            <w:shd w:val="clear" w:color="auto" w:fill="F3F5F8"/>
+            <w:tcMar>
+              <w:top w:w="60" w:type="dxa"/>
+              <w:left w:w="100" w:type="dxa"/>
+              <w:bottom w:w="60" w:type="dxa"/>
+              <w:right w:w="100" w:type="dxa"/>
+            </w:tcMar>
+          </w:tcPr>
+          <w:p>
+            <w:pPr>
+              <w:spacing w:after="40" w:line="260" w:lineRule="auto"/>
+            </w:pPr>
+            <w:r>
+              <w:rPr>
+                <w:sz w:val="17"/>
+                <w:szCs w:val="17"/>
+              </w:rPr>
+              <w:t>Claude</w:t>
+            </w:r>
+          </w:p>
+        </w:tc>
+        <w:tc>
+          <w:tcPr>
+            <w:tcW w:w="6426" w:type="dxa"/>
+            <w:tcBorders>
+              <w:top w:val="single" w:sz="4" w:space="0" w:color="C9D1DC"/>
+              <w:left w:val="single" w:sz="4" w:space="0" w:color="C9D1DC"/>
+              <w:bottom w:val="single" w:sz="4" w:space="0" w:color="C9D1DC"/>
+              <w:right w:val="single" w:sz="4" w:space="0" w:color="C9D1DC"/>
+            </w:tcBorders>
+            <w:shd w:val="clear" w:color="auto" w:fill="F3F5F8"/>
+            <w:tcMar>
+              <w:top w:w="60" w:type="dxa"/>
+              <w:left w:w="100" w:type="dxa"/>
+              <w:bottom w:w="60" w:type="dxa"/>
+              <w:right w:w="100" w:type="dxa"/>
+            </w:tcMar>
+          </w:tcPr>
+          <w:p>
+            <w:pPr>
+              <w:spacing w:after="40" w:line="260" w:lineRule="auto"/>
+            </w:pPr>
+            <w:r>
+              <w:rPr>
+                <w:sz w:val="17"/>
+                <w:szCs w:val="17"/>
+              </w:rPr>
+              <w:t>Explícame la diferencia entre sessionStorage y localStorage y por qué uso sessionStorage.</w:t>
+            </w:r>
+          </w:p>
+        </w:tc>
+      </w:tr>
+      <w:tr>
+        <w:trPr>
+          <w:cantSplit/>
+        </w:trPr>
+        <w:tc>
+          <w:tcPr>
+            <w:tcW w:w="1700" w:type="dxa"/>
+            <w:tcBorders>
+              <w:top w:val="single" w:sz="4" w:space="0" w:color="C9D1DC"/>
+              <w:left w:val="single" w:sz="4" w:space="0" w:color="C9D1DC"/>
+              <w:bottom w:val="single" w:sz="4" w:space="0" w:color="C9D1DC"/>
+              <w:right w:val="single" w:sz="4" w:space="0" w:color="C9D1DC"/>
+            </w:tcBorders>
+            <w:shd w:val="clear" w:color="auto" w:fill="FFFFFF"/>
+            <w:tcMar>
+              <w:top w:w="60" w:type="dxa"/>
+              <w:left w:w="100" w:type="dxa"/>
+              <w:bottom w:w="60" w:type="dxa"/>
+              <w:right w:w="100" w:type="dxa"/>
+            </w:tcMar>
+          </w:tcPr>
+          <w:p>
+            <w:pPr>
+              <w:spacing w:after="40" w:line="260" w:lineRule="auto"/>
+            </w:pPr>
+          </w:p>
+        </w:tc>
+        <w:tc>
+          <w:tcPr>
+            <w:tcW w:w="900" w:type="dxa"/>
+            <w:tcBorders>
+              <w:top w:val="single" w:sz="4" w:space="0" w:color="C9D1DC"/>
+              <w:left w:val="single" w:sz="4" w:space="0" w:color="C9D1DC"/>
+              <w:bottom w:val="single" w:sz="4" w:space="0" w:color="C9D1DC"/>
+              <w:right w:val="single" w:sz="4" w:space="0" w:color="C9D1DC"/>
+            </w:tcBorders>
+            <w:shd w:val="clear" w:color="auto" w:fill="FFFFFF"/>
+            <w:tcMar>
+              <w:top w:w="60" w:type="dxa"/>
+              <w:left w:w="100" w:type="dxa"/>
+              <w:bottom w:w="60" w:type="dxa"/>
+              <w:right w:w="100" w:type="dxa"/>
+            </w:tcMar>
+          </w:tcPr>
+          <w:p>
+            <w:pPr>
+              <w:spacing w:after="40" w:line="260" w:lineRule="auto"/>
+            </w:pPr>
+            <w:r>
+              <w:rPr>
+                <w:sz w:val="17"/>
+                <w:szCs w:val="17"/>
+              </w:rPr>
+              <w:t>Claude</w:t>
+            </w:r>
+          </w:p>
+        </w:tc>
+        <w:tc>
+          <w:tcPr>
+            <w:tcW w:w="6426" w:type="dxa"/>
+            <w:tcBorders>
+              <w:top w:val="single" w:sz="4" w:space="0" w:color="C9D1DC"/>
+              <w:left w:val="single" w:sz="4" w:space="0" w:color="C9D1DC"/>
+              <w:bottom w:val="single" w:sz="4" w:space="0" w:color="C9D1DC"/>
+              <w:right w:val="single" w:sz="4" w:space="0" w:color="C9D1DC"/>
+            </w:tcBorders>
+            <w:shd w:val="clear" w:color="auto" w:fill="FFFFFF"/>
+            <w:tcMar>
+              <w:top w:w="60" w:type="dxa"/>
+              <w:left w:w="100" w:type="dxa"/>
+              <w:bottom w:w="60" w:type="dxa"/>
+              <w:right w:w="100" w:type="dxa"/>
+            </w:tcMar>
+          </w:tcPr>
+          <w:p>
+            <w:pPr>
+              <w:spacing w:after="40" w:line="260" w:lineRule="auto"/>
+            </w:pPr>
+            <w:r>
+              <w:rPr>
+                <w:sz w:val="17"/>
+                <w:szCs w:val="17"/>
+              </w:rPr>
+              <w:t>Escribe un módulo ES que se ejecute solo al importarlo y que pinte el correo en la barra de navegación.</w:t>
+            </w:r>
+          </w:p>
+        </w:tc>
+      </w:tr>
+      <w:tr>
+        <w:trPr>
+          <w:cantSplit/>
+        </w:trPr>
+        <w:tc>
+          <w:tcPr>
+            <w:tcW w:w="1700" w:type="dxa"/>
+            <w:tcBorders>
+              <w:top w:val="single" w:sz="4" w:space="0" w:color="C9D1DC"/>
+              <w:left w:val="single" w:sz="4" w:space="0" w:color="C9D1DC"/>
+              <w:bottom w:val="single" w:sz="4" w:space="0" w:color="C9D1DC"/>
+              <w:right w:val="single" w:sz="4" w:space="0" w:color="C9D1DC"/>
+            </w:tcBorders>
+            <w:shd w:val="clear" w:color="auto" w:fill="F3F5F8"/>
+            <w:tcMar>
+              <w:top w:w="60" w:type="dxa"/>
+              <w:left w:w="100" w:type="dxa"/>
+              <w:bottom w:w="60" w:type="dxa"/>
+              <w:right w:w="100" w:type="dxa"/>
+            </w:tcMar>
+          </w:tcPr>
+          <w:p>
+            <w:pPr>
+              <w:spacing w:after="40" w:line="260" w:lineRule="auto"/>
+            </w:pPr>
+          </w:p>
+        </w:tc>
+        <w:tc>
+          <w:tcPr>
+            <w:tcW w:w="900" w:type="dxa"/>
+            <w:tcBorders>
+              <w:top w:val="single" w:sz="4" w:space="0" w:color="C9D1DC"/>
+              <w:left w:val="single" w:sz="4" w:space="0" w:color="C9D1DC"/>
+              <w:bottom w:val="single" w:sz="4" w:space="0" w:color="C9D1DC"/>
+              <w:right w:val="single" w:sz="4" w:space="0" w:color="C9D1DC"/>
+            </w:tcBorders>
+            <w:shd w:val="clear" w:color="auto" w:fill="F3F5F8"/>
+            <w:tcMar>
+              <w:top w:w="60" w:type="dxa"/>
+              <w:left w:w="100" w:type="dxa"/>
+              <w:bottom w:w="60" w:type="dxa"/>
+              <w:right w:w="100" w:type="dxa"/>
+            </w:tcMar>
+          </w:tcPr>
+          <w:p>
+            <w:pPr>
+              <w:spacing w:after="40" w:line="260" w:lineRule="auto"/>
+            </w:pPr>
+            <w:r>
+              <w:rPr>
+                <w:sz w:val="17"/>
+                <w:szCs w:val="17"/>
+              </w:rPr>
+              <w:t>Claude</w:t>
+            </w:r>
+          </w:p>
+        </w:tc>
+        <w:tc>
+          <w:tcPr>
+            <w:tcW w:w="6426" w:type="dxa"/>
+            <w:tcBorders>
+              <w:top w:val="single" w:sz="4" w:space="0" w:color="C9D1DC"/>
+              <w:left w:val="single" w:sz="4" w:space="0" w:color="C9D1DC"/>
+              <w:bottom w:val="single" w:sz="4" w:space="0" w:color="C9D1DC"/>
+              <w:right w:val="single" w:sz="4" w:space="0" w:color="C9D1DC"/>
+            </w:tcBorders>
+            <w:shd w:val="clear" w:color="auto" w:fill="F3F5F8"/>
+            <w:tcMar>
+              <w:top w:w="60" w:type="dxa"/>
+              <w:left w:w="100" w:type="dxa"/>
+              <w:bottom w:w="60" w:type="dxa"/>
+              <w:right w:w="100" w:type="dxa"/>
+            </w:tcMar>
+          </w:tcPr>
+          <w:p>
+            <w:pPr>
+              <w:spacing w:after="40" w:line="260" w:lineRule="auto"/>
+            </w:pPr>
+            <w:r>
+              <w:rPr>
+                <w:sz w:val="17"/>
+                <w:szCs w:val="17"/>
+              </w:rPr>
+              <w:t>¿Cómo cambio el botón «Iniciar sesión» por «Cerrar sesión» cuando hay una persona logueada?</w:t>
             </w:r>
           </w:p>
         </w:tc>
@@ -12230,6 +10612,7 @@
           <w:sz w:val="25"/>
           <w:szCs w:val="25"/>
         </w:rPr>
+        <w:lastRenderedPageBreak/>
         <w:t>Mapa conceptual hecho a mano</w:t>
       </w:r>
       <w:bookmarkEnd w:id="18"/>
@@ -12315,17 +10698,7 @@
           <w:sz w:val="30"/>
           <w:szCs w:val="30"/>
         </w:rPr>
-        <w:t>8</w:t>
-      </w:r>
-      <w:r>
-        <w:rPr>
-          <w:b/>
-          <w:bCs/>
-          <w:color w:val="1F3A5F"/>
-          <w:sz w:val="30"/>
-          <w:szCs w:val="30"/>
-        </w:rPr>
-        <w:t>. Dificultades, soluciones y reparto de tareas</w:t>
+        <w:t>8. Dificultades, soluciones y reparto de tareas</w:t>
       </w:r>
       <w:bookmarkEnd w:id="20"/>
     </w:p>
@@ -12351,12 +10724,6 @@
         <w:gridCol w:w="5726"/>
       </w:tblGrid>
       <w:tr>
-        <w:tblPrEx>
-          <w:tblCellMar>
-            <w:top w:w="0" w:type="dxa"/>
-            <w:bottom w:w="0" w:type="dxa"/>
-          </w:tblCellMar>
-        </w:tblPrEx>
         <w:trPr>
           <w:tblHeader/>
         </w:trPr>
@@ -12389,7 +10756,6 @@
                 <w:sz w:val="19"/>
                 <w:szCs w:val="19"/>
               </w:rPr>
-              <w:lastRenderedPageBreak/>
               <w:t>Dificultad</w:t>
             </w:r>
           </w:p>
@@ -12429,12 +10795,6 @@
         </w:tc>
       </w:tr>
       <w:tr>
-        <w:tblPrEx>
-          <w:tblCellMar>
-            <w:top w:w="0" w:type="dxa"/>
-            <w:bottom w:w="0" w:type="dxa"/>
-          </w:tblCellMar>
-        </w:tblPrEx>
         <w:trPr>
           <w:cantSplit/>
         </w:trPr>
@@ -12464,144 +10824,42 @@
                 <w:sz w:val="19"/>
                 <w:szCs w:val="19"/>
               </w:rPr>
-              <w:t>El CSS no se cargaba y salía un error de tipo MIME (</w:t>
-            </w:r>
-            <w:proofErr w:type="spellStart"/>
+              <w:t>El CSS no se cargaba y salía un error de tipo MIME (text/html)</w:t>
+            </w:r>
+          </w:p>
+        </w:tc>
+        <w:tc>
+          <w:tcPr>
+            <w:tcW w:w="5726" w:type="dxa"/>
+            <w:tcBorders>
+              <w:top w:val="single" w:sz="4" w:space="0" w:color="C9D1DC"/>
+              <w:left w:val="single" w:sz="4" w:space="0" w:color="C9D1DC"/>
+              <w:bottom w:val="single" w:sz="4" w:space="0" w:color="C9D1DC"/>
+              <w:right w:val="single" w:sz="4" w:space="0" w:color="C9D1DC"/>
+            </w:tcBorders>
+            <w:shd w:val="clear" w:color="auto" w:fill="FFFFFF"/>
+            <w:tcMar>
+              <w:top w:w="60" w:type="dxa"/>
+              <w:left w:w="100" w:type="dxa"/>
+              <w:bottom w:w="60" w:type="dxa"/>
+              <w:right w:w="100" w:type="dxa"/>
+            </w:tcMar>
+          </w:tcPr>
+          <w:p>
+            <w:pPr>
+              <w:spacing w:after="40" w:line="260" w:lineRule="auto"/>
+            </w:pPr>
             <w:r>
               <w:rPr>
                 <w:sz w:val="19"/>
                 <w:szCs w:val="19"/>
               </w:rPr>
-              <w:t>text</w:t>
-            </w:r>
-            <w:proofErr w:type="spellEnd"/>
-            <w:r>
-              <w:rPr>
-                <w:sz w:val="19"/>
-                <w:szCs w:val="19"/>
-              </w:rPr>
-              <w:t>/</w:t>
-            </w:r>
-            <w:proofErr w:type="spellStart"/>
-            <w:r>
-              <w:rPr>
-                <w:sz w:val="19"/>
-                <w:szCs w:val="19"/>
-              </w:rPr>
-              <w:t>html</w:t>
-            </w:r>
-            <w:proofErr w:type="spellEnd"/>
-            <w:r>
-              <w:rPr>
-                <w:sz w:val="19"/>
-                <w:szCs w:val="19"/>
-              </w:rPr>
-              <w:t>)</w:t>
-            </w:r>
-          </w:p>
-        </w:tc>
-        <w:tc>
-          <w:tcPr>
-            <w:tcW w:w="5726" w:type="dxa"/>
-            <w:tcBorders>
-              <w:top w:val="single" w:sz="4" w:space="0" w:color="C9D1DC"/>
-              <w:left w:val="single" w:sz="4" w:space="0" w:color="C9D1DC"/>
-              <w:bottom w:val="single" w:sz="4" w:space="0" w:color="C9D1DC"/>
-              <w:right w:val="single" w:sz="4" w:space="0" w:color="C9D1DC"/>
-            </w:tcBorders>
-            <w:shd w:val="clear" w:color="auto" w:fill="FFFFFF"/>
-            <w:tcMar>
-              <w:top w:w="60" w:type="dxa"/>
-              <w:left w:w="100" w:type="dxa"/>
-              <w:bottom w:w="60" w:type="dxa"/>
-              <w:right w:w="100" w:type="dxa"/>
-            </w:tcMar>
-          </w:tcPr>
-          <w:p>
-            <w:pPr>
-              <w:spacing w:after="40" w:line="260" w:lineRule="auto"/>
-            </w:pPr>
-            <w:r>
-              <w:rPr>
-                <w:sz w:val="19"/>
-                <w:szCs w:val="19"/>
-              </w:rPr>
-              <w:t xml:space="preserve">Las páginas están en </w:t>
-            </w:r>
-            <w:proofErr w:type="spellStart"/>
-            <w:r>
-              <w:rPr>
-                <w:sz w:val="19"/>
-                <w:szCs w:val="19"/>
-              </w:rPr>
-              <w:t>src</w:t>
-            </w:r>
-            <w:proofErr w:type="spellEnd"/>
-            <w:r>
-              <w:rPr>
-                <w:sz w:val="19"/>
-                <w:szCs w:val="19"/>
-              </w:rPr>
-              <w:t>/</w:t>
-            </w:r>
-            <w:proofErr w:type="spellStart"/>
-            <w:r>
-              <w:rPr>
-                <w:sz w:val="19"/>
-                <w:szCs w:val="19"/>
-              </w:rPr>
-              <w:t>pages</w:t>
-            </w:r>
-            <w:proofErr w:type="spellEnd"/>
-            <w:r>
-              <w:rPr>
-                <w:sz w:val="19"/>
-                <w:szCs w:val="19"/>
-              </w:rPr>
-              <w:t>/, así que las rutas deben subir un nivel: ../</w:t>
-            </w:r>
-            <w:proofErr w:type="spellStart"/>
-            <w:r>
-              <w:rPr>
-                <w:sz w:val="19"/>
-                <w:szCs w:val="19"/>
-              </w:rPr>
-              <w:t>css</w:t>
-            </w:r>
-            <w:proofErr w:type="spellEnd"/>
-            <w:r>
-              <w:rPr>
-                <w:sz w:val="19"/>
-                <w:szCs w:val="19"/>
-              </w:rPr>
-              <w:t>/styles.css y ../</w:t>
-            </w:r>
-            <w:proofErr w:type="spellStart"/>
-            <w:r>
-              <w:rPr>
-                <w:sz w:val="19"/>
-                <w:szCs w:val="19"/>
-              </w:rPr>
-              <w:t>js</w:t>
-            </w:r>
-            <w:proofErr w:type="spellEnd"/>
-            <w:r>
-              <w:rPr>
-                <w:sz w:val="19"/>
-                <w:szCs w:val="19"/>
-              </w:rPr>
-              <w:t>/archivo.js.</w:t>
+              <w:t>Las páginas están en src/pages/, así que las rutas deben subir un nivel: ../css/styles.css y ../js/archivo.js.</w:t>
             </w:r>
           </w:p>
         </w:tc>
       </w:tr>
       <w:tr>
-        <w:tblPrEx>
-          <w:tblCellMar>
-            <w:top w:w="0" w:type="dxa"/>
-            <w:bottom w:w="0" w:type="dxa"/>
-          </w:tblCellMar>
-        </w:tblPrEx>
         <w:trPr>
           <w:cantSplit/>
         </w:trPr>
@@ -12667,12 +10925,6 @@
         </w:tc>
       </w:tr>
       <w:tr>
-        <w:tblPrEx>
-          <w:tblCellMar>
-            <w:top w:w="0" w:type="dxa"/>
-            <w:bottom w:w="0" w:type="dxa"/>
-          </w:tblCellMar>
-        </w:tblPrEx>
         <w:trPr>
           <w:cantSplit/>
         </w:trPr>
@@ -12738,12 +10990,6 @@
         </w:tc>
       </w:tr>
       <w:tr>
-        <w:tblPrEx>
-          <w:tblCellMar>
-            <w:top w:w="0" w:type="dxa"/>
-            <w:bottom w:w="0" w:type="dxa"/>
-          </w:tblCellMar>
-        </w:tblPrEx>
         <w:trPr>
           <w:cantSplit/>
         </w:trPr>
@@ -12773,112 +11019,42 @@
                 <w:sz w:val="19"/>
                 <w:szCs w:val="19"/>
               </w:rPr>
-              <w:t xml:space="preserve">Una lista importada con </w:t>
-            </w:r>
-            <w:proofErr w:type="spellStart"/>
+              <w:t>Una lista importada con export const no se puede reasignar desde otro archivo</w:t>
+            </w:r>
+          </w:p>
+        </w:tc>
+        <w:tc>
+          <w:tcPr>
+            <w:tcW w:w="5726" w:type="dxa"/>
+            <w:tcBorders>
+              <w:top w:val="single" w:sz="4" w:space="0" w:color="C9D1DC"/>
+              <w:left w:val="single" w:sz="4" w:space="0" w:color="C9D1DC"/>
+              <w:bottom w:val="single" w:sz="4" w:space="0" w:color="C9D1DC"/>
+              <w:right w:val="single" w:sz="4" w:space="0" w:color="C9D1DC"/>
+            </w:tcBorders>
+            <w:shd w:val="clear" w:color="auto" w:fill="F3F5F8"/>
+            <w:tcMar>
+              <w:top w:w="60" w:type="dxa"/>
+              <w:left w:w="100" w:type="dxa"/>
+              <w:bottom w:w="60" w:type="dxa"/>
+              <w:right w:w="100" w:type="dxa"/>
+            </w:tcMar>
+          </w:tcPr>
+          <w:p>
+            <w:pPr>
+              <w:spacing w:after="40" w:line="260" w:lineRule="auto"/>
+            </w:pPr>
             <w:r>
               <w:rPr>
                 <w:sz w:val="19"/>
                 <w:szCs w:val="19"/>
               </w:rPr>
-              <w:t>export</w:t>
-            </w:r>
-            <w:proofErr w:type="spellEnd"/>
-            <w:r>
-              <w:rPr>
-                <w:sz w:val="19"/>
-                <w:szCs w:val="19"/>
-              </w:rPr>
-              <w:t xml:space="preserve"> </w:t>
-            </w:r>
-            <w:proofErr w:type="spellStart"/>
-            <w:r>
-              <w:rPr>
-                <w:sz w:val="19"/>
-                <w:szCs w:val="19"/>
-              </w:rPr>
-              <w:t>const</w:t>
-            </w:r>
-            <w:proofErr w:type="spellEnd"/>
-            <w:r>
-              <w:rPr>
-                <w:sz w:val="19"/>
-                <w:szCs w:val="19"/>
-              </w:rPr>
-              <w:t xml:space="preserve"> no se puede reasignar desde otro archivo</w:t>
-            </w:r>
-          </w:p>
-        </w:tc>
-        <w:tc>
-          <w:tcPr>
-            <w:tcW w:w="5726" w:type="dxa"/>
-            <w:tcBorders>
-              <w:top w:val="single" w:sz="4" w:space="0" w:color="C9D1DC"/>
-              <w:left w:val="single" w:sz="4" w:space="0" w:color="C9D1DC"/>
-              <w:bottom w:val="single" w:sz="4" w:space="0" w:color="C9D1DC"/>
-              <w:right w:val="single" w:sz="4" w:space="0" w:color="C9D1DC"/>
-            </w:tcBorders>
-            <w:shd w:val="clear" w:color="auto" w:fill="F3F5F8"/>
-            <w:tcMar>
-              <w:top w:w="60" w:type="dxa"/>
-              <w:left w:w="100" w:type="dxa"/>
-              <w:bottom w:w="60" w:type="dxa"/>
-              <w:right w:w="100" w:type="dxa"/>
-            </w:tcMar>
-          </w:tcPr>
-          <w:p>
-            <w:pPr>
-              <w:spacing w:after="40" w:line="260" w:lineRule="auto"/>
-            </w:pPr>
-            <w:r>
-              <w:rPr>
-                <w:sz w:val="19"/>
-                <w:szCs w:val="19"/>
-              </w:rPr>
-              <w:t xml:space="preserve">Se modifican con </w:t>
-            </w:r>
-            <w:proofErr w:type="spellStart"/>
-            <w:r>
-              <w:rPr>
-                <w:sz w:val="19"/>
-                <w:szCs w:val="19"/>
-              </w:rPr>
-              <w:t>push</w:t>
-            </w:r>
-            <w:proofErr w:type="spellEnd"/>
-            <w:r>
-              <w:rPr>
-                <w:sz w:val="19"/>
-                <w:szCs w:val="19"/>
-              </w:rPr>
-              <w:t xml:space="preserve"> y </w:t>
-            </w:r>
-            <w:proofErr w:type="spellStart"/>
-            <w:r>
-              <w:rPr>
-                <w:sz w:val="19"/>
-                <w:szCs w:val="19"/>
-              </w:rPr>
-              <w:t>splice</w:t>
-            </w:r>
-            <w:proofErr w:type="spellEnd"/>
-            <w:r>
-              <w:rPr>
-                <w:sz w:val="19"/>
-                <w:szCs w:val="19"/>
-              </w:rPr>
-              <w:t>, que sí están permitidos.</w:t>
+              <w:t>Se modifican con push y splice, que sí están permitidos.</w:t>
             </w:r>
           </w:p>
         </w:tc>
       </w:tr>
       <w:tr>
-        <w:tblPrEx>
-          <w:tblCellMar>
-            <w:top w:w="0" w:type="dxa"/>
-            <w:bottom w:w="0" w:type="dxa"/>
-          </w:tblCellMar>
-        </w:tblPrEx>
         <w:trPr>
           <w:cantSplit/>
         </w:trPr>
@@ -12938,34 +11114,12 @@
                 <w:sz w:val="19"/>
                 <w:szCs w:val="19"/>
               </w:rPr>
-              <w:t xml:space="preserve">Todo texto de usuario se pinta con </w:t>
-            </w:r>
-            <w:proofErr w:type="spellStart"/>
-            <w:r>
-              <w:rPr>
-                <w:sz w:val="19"/>
-                <w:szCs w:val="19"/>
-              </w:rPr>
-              <w:t>escaparHtml</w:t>
-            </w:r>
-            <w:proofErr w:type="spellEnd"/>
-            <w:r>
-              <w:rPr>
-                <w:sz w:val="19"/>
-                <w:szCs w:val="19"/>
-              </w:rPr>
-              <w:t xml:space="preserve"> para que no se ejecute.</w:t>
+              <w:t>Todo texto de usuario se pinta con escaparHtml para que no se ejecute.</w:t>
             </w:r>
           </w:p>
         </w:tc>
       </w:tr>
       <w:tr>
-        <w:tblPrEx>
-          <w:tblCellMar>
-            <w:top w:w="0" w:type="dxa"/>
-            <w:bottom w:w="0" w:type="dxa"/>
-          </w:tblCellMar>
-        </w:tblPrEx>
         <w:trPr>
           <w:cantSplit/>
         </w:trPr>
@@ -13025,39 +11179,7 @@
                 <w:sz w:val="19"/>
                 <w:szCs w:val="19"/>
               </w:rPr>
-              <w:t xml:space="preserve">Se combinó </w:t>
-            </w:r>
-            <w:proofErr w:type="spellStart"/>
-            <w:r>
-              <w:rPr>
-                <w:sz w:val="19"/>
-                <w:szCs w:val="19"/>
-              </w:rPr>
-              <w:t>checkValidity</w:t>
-            </w:r>
-            <w:proofErr w:type="spellEnd"/>
-            <w:r>
-              <w:rPr>
-                <w:sz w:val="19"/>
-                <w:szCs w:val="19"/>
-              </w:rPr>
-              <w:t xml:space="preserve"> con </w:t>
-            </w:r>
-            <w:proofErr w:type="spellStart"/>
-            <w:r>
-              <w:rPr>
-                <w:sz w:val="19"/>
-                <w:szCs w:val="19"/>
-              </w:rPr>
-              <w:t>setCustomValidity</w:t>
-            </w:r>
-            <w:proofErr w:type="spellEnd"/>
-            <w:r>
-              <w:rPr>
-                <w:sz w:val="19"/>
-                <w:szCs w:val="19"/>
-              </w:rPr>
-              <w:t xml:space="preserve"> y un mensaje propio.</w:t>
+              <w:t>Se combinó checkValidity con setCustomValidity y un mensaje propio.</w:t>
             </w:r>
           </w:p>
         </w:tc>
@@ -13109,12 +11231,6 @@
         <w:gridCol w:w="6626"/>
       </w:tblGrid>
       <w:tr>
-        <w:tblPrEx>
-          <w:tblCellMar>
-            <w:top w:w="0" w:type="dxa"/>
-            <w:bottom w:w="0" w:type="dxa"/>
-          </w:tblCellMar>
-        </w:tblPrEx>
         <w:trPr>
           <w:tblHeader/>
         </w:trPr>
@@ -13186,12 +11302,6 @@
         </w:tc>
       </w:tr>
       <w:tr>
-        <w:tblPrEx>
-          <w:tblCellMar>
-            <w:top w:w="0" w:type="dxa"/>
-            <w:bottom w:w="0" w:type="dxa"/>
-          </w:tblCellMar>
-        </w:tblPrEx>
         <w:trPr>
           <w:cantSplit/>
         </w:trPr>
@@ -13251,98 +11361,12 @@
                 <w:sz w:val="19"/>
                 <w:szCs w:val="19"/>
               </w:rPr>
-              <w:t xml:space="preserve">Montaje del repositorio con </w:t>
-            </w:r>
-            <w:proofErr w:type="spellStart"/>
-            <w:r>
-              <w:rPr>
-                <w:sz w:val="19"/>
-                <w:szCs w:val="19"/>
-              </w:rPr>
-              <w:t>Gitflow</w:t>
-            </w:r>
-            <w:proofErr w:type="spellEnd"/>
-            <w:r>
-              <w:rPr>
-                <w:sz w:val="19"/>
-                <w:szCs w:val="19"/>
-              </w:rPr>
-              <w:t xml:space="preserve"> y revisión de los </w:t>
-            </w:r>
-            <w:proofErr w:type="spellStart"/>
-            <w:r>
-              <w:rPr>
-                <w:sz w:val="19"/>
-                <w:szCs w:val="19"/>
-              </w:rPr>
-              <w:t>pull</w:t>
-            </w:r>
-            <w:proofErr w:type="spellEnd"/>
-            <w:r>
-              <w:rPr>
-                <w:sz w:val="19"/>
-                <w:szCs w:val="19"/>
-              </w:rPr>
-              <w:t xml:space="preserve"> </w:t>
-            </w:r>
-            <w:proofErr w:type="spellStart"/>
-            <w:r>
-              <w:rPr>
-                <w:sz w:val="19"/>
-                <w:szCs w:val="19"/>
-              </w:rPr>
-              <w:t>requests</w:t>
-            </w:r>
-            <w:proofErr w:type="spellEnd"/>
-            <w:r>
-              <w:rPr>
-                <w:sz w:val="19"/>
-                <w:szCs w:val="19"/>
-              </w:rPr>
-              <w:t xml:space="preserve">. Base común: datos.js, utils.js, plantilla, barra de navegación y estilos. Programación de las pantallas </w:t>
-            </w:r>
-            <w:proofErr w:type="spellStart"/>
-            <w:r>
-              <w:rPr>
-                <w:sz w:val="19"/>
-                <w:szCs w:val="19"/>
-              </w:rPr>
-              <w:t>Dashboard</w:t>
-            </w:r>
-            <w:proofErr w:type="spellEnd"/>
-            <w:r>
-              <w:rPr>
-                <w:sz w:val="19"/>
-                <w:szCs w:val="19"/>
-              </w:rPr>
-              <w:t>, Login, Usuarios e Intercambios. Coordinación del mapa conceptual y publicación de la versión final (</w:t>
-            </w:r>
-            <w:proofErr w:type="spellStart"/>
-            <w:r>
-              <w:rPr>
-                <w:sz w:val="19"/>
-                <w:szCs w:val="19"/>
-              </w:rPr>
-              <w:t>release</w:t>
-            </w:r>
-            <w:proofErr w:type="spellEnd"/>
-            <w:r>
-              <w:rPr>
-                <w:sz w:val="19"/>
-                <w:szCs w:val="19"/>
-              </w:rPr>
-              <w:t xml:space="preserve"> 1.0).</w:t>
+              <w:t>Montaje del repositorio con Gitflow y revisión de los pull requests. Base común: datos.js, utils.js, plantilla, barra de navegación y estilos. Programación de las pantallas Dashboard, Login, Usuarios e Intercambios. Coordinación del mapa conceptual y publicación de la versión final (release 1.0).</w:t>
             </w:r>
           </w:p>
         </w:tc>
       </w:tr>
       <w:tr>
-        <w:tblPrEx>
-          <w:tblCellMar>
-            <w:top w:w="0" w:type="dxa"/>
-            <w:bottom w:w="0" w:type="dxa"/>
-          </w:tblCellMar>
-        </w:tblPrEx>
         <w:trPr>
           <w:cantSplit/>
         </w:trPr>
@@ -13408,12 +11432,6 @@
         </w:tc>
       </w:tr>
       <w:tr>
-        <w:tblPrEx>
-          <w:tblCellMar>
-            <w:top w:w="0" w:type="dxa"/>
-            <w:bottom w:w="0" w:type="dxa"/>
-          </w:tblCellMar>
-        </w:tblPrEx>
         <w:trPr>
           <w:cantSplit/>
         </w:trPr>
@@ -13443,6 +11461,7 @@
                 <w:sz w:val="19"/>
                 <w:szCs w:val="19"/>
               </w:rPr>
+              <w:lastRenderedPageBreak/>
               <w:t>Gerard Garro (Persona 3)</w:t>
             </w:r>
           </w:p>
@@ -13473,23 +11492,7 @@
                 <w:sz w:val="19"/>
                 <w:szCs w:val="19"/>
               </w:rPr>
-              <w:t xml:space="preserve">Arquetipos de usuario, bibliografía y descripción de arquitectura y usabilidad, revisión de los </w:t>
-            </w:r>
-            <w:proofErr w:type="spellStart"/>
-            <w:r>
-              <w:rPr>
-                <w:sz w:val="19"/>
-                <w:szCs w:val="19"/>
-              </w:rPr>
-              <w:t>prompts</w:t>
-            </w:r>
-            <w:proofErr w:type="spellEnd"/>
-            <w:r>
-              <w:rPr>
-                <w:sz w:val="19"/>
-                <w:szCs w:val="19"/>
-              </w:rPr>
-              <w:t xml:space="preserve"> de IA de cada archivo, capturas de pantalla para la memoria y participación en el mapa conceptual.</w:t>
+              <w:t>Arquetipos de usuario, bibliografía y descripción de arquitectura y usabilidad, revisión de los prompts de IA de cada archivo, capturas de pantalla para la memoria y participación en el mapa conceptual.</w:t>
             </w:r>
           </w:p>
         </w:tc>

</xml_diff>